<commit_message>
auto: atualização dashboard — 12/08/2026 15:35 BRT
- Dados Open-Meteo ERA5-Land: 07/2026 incorporados
- Índices oceânicos atualizados (PSL/NOAA)
- SARIMAX x XGBoost comparados e melhor selecionado
- Cenários e BH recalculados
- Relatório executivo regerado
</commit_message>
<xml_diff>
--- a/docs/relatorio-executivo.docx
+++ b/docs/relatorio-executivo.docx
@@ -149,7 +149,7 @@
           <w:color w:val="A8322C"/>
           <w:sz w:val="19"/>
         </w:rPr>
-        <w:t>1.409 mm</w:t>
+        <w:t>1.470 mm</w:t>
       </w:r>
       <w:r>
         <w:rPr>
@@ -169,7 +169,7 @@
           <w:color w:val="A8322C"/>
           <w:sz w:val="19"/>
         </w:rPr>
-        <w:t>17,8% abaixo</w:t>
+        <w:t>14,3% abaixo</w:t>
       </w:r>
       <w:r>
         <w:rPr>
@@ -179,7 +179,7 @@
           <w:color w:val="000000"/>
           <w:sz w:val="19"/>
         </w:rPr>
-        <w:t xml:space="preserve"> da média histórica de 1.714 mm (1981–2025), com 64,6% de probabilidade de ano seco. O núcleo chuvoso de dezembro a março permanece operacionalmente viável, com volumes </w:t>
+        <w:t xml:space="preserve"> da média histórica de 1.714 mm (1981–2025), com 52,0% de probabilidade de ano seco. O núcleo chuvoso de dezembro a março permanece operacionalmente viável, com volumes </w:t>
       </w:r>
       <w:r>
         <w:rPr>
@@ -189,7 +189,7 @@
           <w:color w:val="000000"/>
           <w:sz w:val="19"/>
         </w:rPr>
-        <w:t>12% a 19% menores que a climatologia.</w:t>
+        <w:t>64% a 99% menores que a climatologia.</w:t>
       </w:r>
     </w:p>
     <w:p>
@@ -589,7 +589,7 @@
                 <w:color w:val="A8322C"/>
                 <w:sz w:val="17"/>
               </w:rPr>
-              <w:t>1.409</w:t>
+              <w:t>1.470</w:t>
             </w:r>
           </w:p>
         </w:tc>
@@ -612,7 +612,7 @@
                 <w:color w:val="A8322C"/>
                 <w:sz w:val="17"/>
               </w:rPr>
-              <w:t>−17,8%</w:t>
+              <w:t>−14,3%</w:t>
             </w:r>
           </w:p>
         </w:tc>
@@ -635,7 +635,7 @@
                 <w:color w:val="A8322C"/>
                 <w:sz w:val="17"/>
               </w:rPr>
-              <w:t>64,6%</w:t>
+              <w:t>52,0%</w:t>
             </w:r>
           </w:p>
         </w:tc>
@@ -658,7 +658,7 @@
                 <w:color w:val="A8322C"/>
                 <w:sz w:val="17"/>
               </w:rPr>
-              <w:t>427</w:t>
+              <w:t>524</w:t>
             </w:r>
           </w:p>
         </w:tc>
@@ -726,7 +726,7 @@
                 <w:color w:val="000000"/>
                 <w:sz w:val="17"/>
               </w:rPr>
-              <w:t>1.491</w:t>
+              <w:t>1.541</w:t>
             </w:r>
           </w:p>
         </w:tc>
@@ -748,7 +748,7 @@
                 <w:color w:val="000000"/>
                 <w:sz w:val="17"/>
               </w:rPr>
-              <w:t>−13,0%</w:t>
+              <w:t>−10,1%</w:t>
             </w:r>
           </w:p>
         </w:tc>
@@ -770,7 +770,7 @@
                 <w:color w:val="000000"/>
                 <w:sz w:val="17"/>
               </w:rPr>
-              <w:t>45,6%</w:t>
+              <w:t>34,4%</w:t>
             </w:r>
           </w:p>
         </w:tc>
@@ -792,7 +792,7 @@
                 <w:color w:val="000000"/>
                 <w:sz w:val="17"/>
               </w:rPr>
-              <w:t>407</w:t>
+              <w:t>490</w:t>
             </w:r>
           </w:p>
         </w:tc>
@@ -814,7 +814,7 @@
                 <w:color w:val="000000"/>
                 <w:sz w:val="17"/>
               </w:rPr>
-              <w:t>6</w:t>
+              <w:t>5</w:t>
             </w:r>
           </w:p>
         </w:tc>
@@ -861,7 +861,7 @@
                 <w:color w:val="000000"/>
                 <w:sz w:val="17"/>
               </w:rPr>
-              <w:t>1.546</w:t>
+              <w:t>1.592</w:t>
             </w:r>
           </w:p>
         </w:tc>
@@ -884,7 +884,7 @@
                 <w:color w:val="000000"/>
                 <w:sz w:val="17"/>
               </w:rPr>
-              <w:t>−9,8%</w:t>
+              <w:t>−7,1%</w:t>
             </w:r>
           </w:p>
         </w:tc>
@@ -907,7 +907,7 @@
                 <w:color w:val="000000"/>
                 <w:sz w:val="17"/>
               </w:rPr>
-              <w:t>33,1%</w:t>
+              <w:t>24,1%</w:t>
             </w:r>
           </w:p>
         </w:tc>
@@ -930,7 +930,7 @@
                 <w:color w:val="000000"/>
                 <w:sz w:val="17"/>
               </w:rPr>
-              <w:t>395</w:t>
+              <w:t>464</w:t>
             </w:r>
           </w:p>
         </w:tc>
@@ -953,7 +953,7 @@
                 <w:color w:val="000000"/>
                 <w:sz w:val="17"/>
               </w:rPr>
-              <w:t>6</w:t>
+              <w:t>5</w:t>
             </w:r>
           </w:p>
         </w:tc>
@@ -998,7 +998,7 @@
                 <w:color w:val="000000"/>
                 <w:sz w:val="17"/>
               </w:rPr>
-              <w:t>1.636</w:t>
+              <w:t>1.683</w:t>
             </w:r>
           </w:p>
         </w:tc>
@@ -1020,7 +1020,7 @@
                 <w:color w:val="000000"/>
                 <w:sz w:val="17"/>
               </w:rPr>
-              <w:t>−4,6%</w:t>
+              <w:t>−1,8%</w:t>
             </w:r>
           </w:p>
         </w:tc>
@@ -1042,7 +1042,7 @@
                 <w:color w:val="000000"/>
                 <w:sz w:val="17"/>
               </w:rPr>
-              <w:t>16,1%</w:t>
+              <w:t>11,2%</w:t>
             </w:r>
           </w:p>
         </w:tc>
@@ -1064,7 +1064,7 @@
                 <w:color w:val="000000"/>
                 <w:sz w:val="17"/>
               </w:rPr>
-              <w:t>368</w:t>
+              <w:t>417</w:t>
             </w:r>
           </w:p>
         </w:tc>
@@ -1133,7 +1133,7 @@
                 <w:color w:val="000000"/>
                 <w:sz w:val="17"/>
               </w:rPr>
-              <w:t>1.736</w:t>
+              <w:t>1.786</w:t>
             </w:r>
           </w:p>
         </w:tc>
@@ -1156,7 +1156,7 @@
                 <w:color w:val="000000"/>
                 <w:sz w:val="17"/>
               </w:rPr>
-              <w:t>+1,3%</w:t>
+              <w:t>+4,2%</w:t>
             </w:r>
           </w:p>
         </w:tc>
@@ -1179,7 +1179,7 @@
                 <w:color w:val="000000"/>
                 <w:sz w:val="17"/>
               </w:rPr>
-              <w:t>4,5%</w:t>
+              <w:t>3,8%</w:t>
             </w:r>
           </w:p>
         </w:tc>
@@ -1202,7 +1202,7 @@
                 <w:color w:val="000000"/>
                 <w:sz w:val="17"/>
               </w:rPr>
-              <w:t>331</w:t>
+              <w:t>365</w:t>
             </w:r>
           </w:p>
         </w:tc>
@@ -1393,7 +1393,7 @@
           <w:color w:val="595959"/>
           <w:sz w:val="17"/>
         </w:rPr>
-        <w:t>o cenário central eleva o déficit anual em 56 mm sobrea climatologia e adiciona 2 meses de solo esgotado. O excedente hídrico cai de 619 mm para 370 mm — redução de 40% na recarga do perfil.</w:t>
+        <w:t>o cenário central eleva o déficit anual em 153 mm sobrea climatologia e adiciona 2 meses de solo esgotado. O excedente hídrico cai de 619 mm para 527 mm — redução de 15% na recarga do perfil.</w:t>
       </w:r>
     </w:p>
     <w:p>
@@ -1448,7 +1448,7 @@
           <w:color w:val="000000"/>
           <w:sz w:val="19"/>
         </w:rPr>
-        <w:t xml:space="preserve"> do horizonte — sendo a maior sequência contínua de 4 meses —, contra 4 na climatologia. </w:t>
+        <w:t xml:space="preserve"> do horizonte — sendo a maior sequência contínua de 6 meses —, contra 4 na climatologia. </w:t>
       </w:r>
       <w:r>
         <w:rPr>
@@ -1458,7 +1458,7 @@
           <w:color w:val="000000"/>
           <w:sz w:val="19"/>
         </w:rPr>
-        <w:t>Na entrada da estação chuvosa, outubro projeta 101 mm contra 120 mm da climatologia</w:t>
+        <w:t>Na entrada da estação chuvosa, outubro projeta 212 mm contra 120 mm da climatologia</w:t>
       </w:r>
       <w:r>
         <w:rPr>
@@ -1468,7 +1468,7 @@
           <w:color w:val="000000"/>
           <w:sz w:val="19"/>
         </w:rPr>
-        <w:t xml:space="preserve"> e novembro, 137 mm contra 159 mm</w:t>
+        <w:t xml:space="preserve"> e novembro, 64 mm contra 159 mm</w:t>
       </w:r>
       <w:r>
         <w:rPr>
@@ -2104,7 +2104,7 @@
           <w:color w:val="000000"/>
           <w:sz w:val="19"/>
         </w:rPr>
-        <w:t>Uma reclassificação do evento para El Niño moderado altera a projeção de 1.409 mm para 1.491 mm e a probabilidade de ano seco de 64,6% para 45,6%, o que redefine a postura da janela de transição.</w:t>
+        <w:t>Uma reclassificação do evento para El Niño moderado altera a projeção de 1.470 mm para 1.541 mm e a probabilidade de ano seco de 52,0% para 34,4%, o que redefine a postura da janela de transição.</w:t>
       </w:r>
     </w:p>
     <w:p>

</xml_diff>

<commit_message>
auto: atualização dashboard — 12/08/2026 16:31 BRT
- Dados Open-Meteo ERA5-Land: 07/2026 incorporados
- Índices oceânicos atualizados (PSL/NOAA)
- SARIMAX x XGBoost comparados e melhor selecionado
- Cenários e BH recalculados
- Relatório executivo regerado
</commit_message>
<xml_diff>
--- a/docs/relatorio-executivo.docx
+++ b/docs/relatorio-executivo.docx
@@ -35,7 +35,7 @@
     </w:p>
     <w:p>
       <w:pPr>
-        <w:spacing w:after="200"/>
+        <w:spacing w:after="180"/>
         <w:pBdr>
           <w:bottom w:val="single" w:sz="12" w:space="4" w:color="1F4D2E"/>
         </w:pBdr>
@@ -149,7 +149,7 @@
           <w:color w:val="A8322C"/>
           <w:sz w:val="19"/>
         </w:rPr>
-        <w:t>1.470 mm</w:t>
+        <w:t>1.469 mm</w:t>
       </w:r>
       <w:r>
         <w:rPr>
@@ -179,7 +179,7 @@
           <w:color w:val="000000"/>
           <w:sz w:val="19"/>
         </w:rPr>
-        <w:t xml:space="preserve"> da média histórica de 1.714 mm (1981–2025), com 52,0% de probabilidade de ano seco. O núcleo chuvoso de dezembro a março permanece operacionalmente viável, com volumes </w:t>
+        <w:t xml:space="preserve"> da média histórica de 1.714 mm (1981–2025), com 51,6% de probabilidade de ano seco. O núcleo chuvoso de dezembro a março permanece operacionalmente viável, com volumes </w:t>
       </w:r>
       <w:r>
         <w:rPr>
@@ -379,7 +379,6 @@
     </w:p>
     <w:tbl>
       <w:tblPr>
-        <w:tblW w:type="auto" w:w="0"/>
         <w:jc w:val="left"/>
         <w:tblLook w:firstColumn="1" w:firstRow="1" w:lastColumn="0" w:lastRow="0" w:noHBand="0" w:noVBand="1" w:val="04A0"/>
         <w:tblBorders>
@@ -390,7 +389,6 @@
           <w:insideH w:val="single" w:sz="2" w:space="0" w:color="D9D9D9"/>
           <w:insideV w:val="none" w:sz="0" w:space="0" w:color="FFFFFF"/>
         </w:tblBorders>
-        <w:tblLayout w:type="fixed"/>
         <w:tblCellMar>
           <w:top w:w="60" w:type="dxa"/>
           <w:bottom w:w="60" w:type="dxa"/>
@@ -589,7 +587,7 @@
                 <w:color w:val="A8322C"/>
                 <w:sz w:val="17"/>
               </w:rPr>
-              <w:t>1.470</w:t>
+              <w:t>1.469</w:t>
             </w:r>
           </w:p>
         </w:tc>
@@ -635,7 +633,7 @@
                 <w:color w:val="A8322C"/>
                 <w:sz w:val="17"/>
               </w:rPr>
-              <w:t>52,0%</w:t>
+              <w:t>51,6%</w:t>
             </w:r>
           </w:p>
         </w:tc>
@@ -726,7 +724,7 @@
                 <w:color w:val="000000"/>
                 <w:sz w:val="17"/>
               </w:rPr>
-              <w:t>1.541</w:t>
+              <w:t>1.540</w:t>
             </w:r>
           </w:p>
         </w:tc>
@@ -748,7 +746,7 @@
                 <w:color w:val="000000"/>
                 <w:sz w:val="17"/>
               </w:rPr>
-              <w:t>−10,1%</w:t>
+              <w:t>−10,2%</w:t>
             </w:r>
           </w:p>
         </w:tc>
@@ -770,7 +768,7 @@
                 <w:color w:val="000000"/>
                 <w:sz w:val="17"/>
               </w:rPr>
-              <w:t>34,4%</w:t>
+              <w:t>33,4%</w:t>
             </w:r>
           </w:p>
         </w:tc>
@@ -907,7 +905,7 @@
                 <w:color w:val="000000"/>
                 <w:sz w:val="17"/>
               </w:rPr>
-              <w:t>24,1%</w:t>
+              <w:t>24,8%</w:t>
             </w:r>
           </w:p>
         </w:tc>
@@ -998,7 +996,7 @@
                 <w:color w:val="000000"/>
                 <w:sz w:val="17"/>
               </w:rPr>
-              <w:t>1.683</w:t>
+              <w:t>1.682</w:t>
             </w:r>
           </w:p>
         </w:tc>
@@ -1020,7 +1018,7 @@
                 <w:color w:val="000000"/>
                 <w:sz w:val="17"/>
               </w:rPr>
-              <w:t>−1,8%</w:t>
+              <w:t>−1,9%</w:t>
             </w:r>
           </w:p>
         </w:tc>
@@ -1042,7 +1040,7 @@
                 <w:color w:val="000000"/>
                 <w:sz w:val="17"/>
               </w:rPr>
-              <w:t>11,2%</w:t>
+              <w:t>11,4%</w:t>
             </w:r>
           </w:p>
         </w:tc>
@@ -1179,7 +1177,7 @@
                 <w:color w:val="000000"/>
                 <w:sz w:val="17"/>
               </w:rPr>
-              <w:t>3,8%</w:t>
+              <w:t>3,9%</w:t>
             </w:r>
           </w:p>
         </w:tc>
@@ -1543,7 +1541,6 @@
     </w:p>
     <w:tbl>
       <w:tblPr>
-        <w:tblW w:type="auto" w:w="0"/>
         <w:jc w:val="left"/>
         <w:tblLook w:firstColumn="1" w:firstRow="1" w:lastColumn="0" w:lastRow="0" w:noHBand="0" w:noVBand="1" w:val="04A0"/>
         <w:tblBorders>
@@ -1554,7 +1551,6 @@
           <w:insideH w:val="single" w:sz="2" w:space="0" w:color="D9D9D9"/>
           <w:insideV w:val="none" w:sz="0" w:space="0" w:color="FFFFFF"/>
         </w:tblBorders>
-        <w:tblLayout w:type="fixed"/>
         <w:tblCellMar>
           <w:top w:w="60" w:type="dxa"/>
           <w:bottom w:w="60" w:type="dxa"/>
@@ -2104,7 +2100,7 @@
           <w:color w:val="000000"/>
           <w:sz w:val="19"/>
         </w:rPr>
-        <w:t>Uma reclassificação do evento para El Niño moderado altera a projeção de 1.470 mm para 1.541 mm e a probabilidade de ano seco de 52,0% para 34,4%, o que redefine a postura da janela de transição.</w:t>
+        <w:t>Uma reclassificação do evento para El Niño moderado altera a projeção de 1.469 mm para 1.540 mm e a probabilidade de ano seco de 51,6% para 33,4%, o que redefine a postura da janela de transição.</w:t>
       </w:r>
     </w:p>
     <w:p>
@@ -2126,13 +2122,60 @@
       </w:r>
     </w:p>
     <w:sectPr>
+      <w:headerReference w:type="default" r:id="rId9"/>
       <w:pgSz w:w="12240" w:h="15840"/>
-      <w:pgMar w:top="1000" w:right="1080" w:bottom="900" w:left="1080" w:header="720" w:footer="720" w:gutter="0"/>
+      <w:pgMar w:top="1500" w:right="1080" w:bottom="900" w:left="1080" w:header="420" w:footer="720" w:gutter="0"/>
       <w:cols w:space="720"/>
       <w:docGrid w:linePitch="360"/>
     </w:sectPr>
   </w:body>
 </w:document>
+</file>
+
+<file path=word/header1.xml><?xml version="1.0" encoding="utf-8"?>
+<w:hdr xmlns:m="http://schemas.openxmlformats.org/officeDocument/2006/math" xmlns:mc="http://schemas.openxmlformats.org/markup-compatibility/2006" xmlns:mo="http://schemas.microsoft.com/office/mac/office/2008/main" xmlns:mv="urn:schemas-microsoft-com:mac:vml" xmlns:o="urn:schemas-microsoft-com:office:office" xmlns:r="http://schemas.openxmlformats.org/officeDocument/2006/relationships" xmlns:v="urn:schemas-microsoft-com:vml" xmlns:w10="urn:schemas-microsoft-com:office:word" xmlns:w14="http://schemas.microsoft.com/office/word/2010/wordml" xmlns:w="http://schemas.openxmlformats.org/wordprocessingml/2006/main" xmlns:wne="http://schemas.microsoft.com/office/word/2006/wordml" xmlns:wp14="http://schemas.microsoft.com/office/word/2010/wordprocessingDrawing" xmlns:wp="http://schemas.openxmlformats.org/drawingml/2006/wordprocessingDrawing" xmlns:wpc="http://schemas.microsoft.com/office/word/2010/wordprocessingCanvas" xmlns:wpg="http://schemas.microsoft.com/office/word/2010/wordprocessingGroup" xmlns:wpi="http://schemas.microsoft.com/office/word/2010/wordprocessingInk" xmlns:wps="http://schemas.microsoft.com/office/word/2010/wordprocessingShape" mc:Ignorable="w14 wp14">
+  <w:p>
+    <w:pPr>
+      <w:pStyle w:val="Header"/>
+      <w:spacing w:after="0"/>
+      <w:jc w:val="right"/>
+    </w:pPr>
+    <w:r>
+      <w:drawing>
+        <wp:inline xmlns:a="http://schemas.openxmlformats.org/drawingml/2006/main" xmlns:pic="http://schemas.openxmlformats.org/drawingml/2006/picture">
+          <wp:extent cx="1371600" cy="488089"/>
+          <wp:docPr id="1" name="Picture 1"/>
+          <wp:cNvGraphicFramePr>
+            <a:graphicFrameLocks noChangeAspect="1"/>
+          </wp:cNvGraphicFramePr>
+          <a:graphic>
+            <a:graphicData uri="http://schemas.openxmlformats.org/drawingml/2006/picture">
+              <pic:pic>
+                <pic:nvPicPr>
+                  <pic:cNvPr id="0" name="logo-sinobras.png"/>
+                  <pic:cNvPicPr/>
+                </pic:nvPicPr>
+                <pic:blipFill>
+                  <a:blip r:embed="rId1"/>
+                  <a:stretch>
+                    <a:fillRect/>
+                  </a:stretch>
+                </pic:blipFill>
+                <pic:spPr>
+                  <a:xfrm>
+                    <a:off x="0" y="0"/>
+                    <a:ext cx="1371600" cy="488089"/>
+                  </a:xfrm>
+                  <a:prstGeom prst="rect"/>
+                </pic:spPr>
+              </pic:pic>
+            </a:graphicData>
+          </a:graphic>
+        </wp:inline>
+      </w:drawing>
+    </w:r>
+  </w:p>
+</w:hdr>
 </file>
 
 <file path=word/numbering.xml><?xml version="1.0" encoding="utf-8"?>

</xml_diff>

<commit_message>
auto: atualização dashboard — 13/08/2026 09:02 BRT
- Dados Open-Meteo ERA5-Land: 07/2026 incorporados
- Índices oceânicos atualizados (PSL/NOAA)
- SARIMAX x XGBoost comparados e melhor selecionado
- Cenários e BH recalculados
- Relatório executivo regerado
</commit_message>
<xml_diff>
--- a/docs/relatorio-executivo.docx
+++ b/docs/relatorio-executivo.docx
@@ -48,7 +48,7 @@
           <w:color w:val="595959"/>
           <w:sz w:val="17"/>
         </w:rPr>
-        <w:t>Norte do Tocantins  ·  Horizonte ago/2026 – jul/2027  ·  Emissão 12/08/2026</w:t>
+        <w:t>Norte do Tocantins  ·  Horizonte ago/2026 – jul/2027  ·  Emissão 13/08/2026</w:t>
       </w:r>
     </w:p>
     <w:p>
@@ -149,7 +149,7 @@
           <w:color w:val="A8322C"/>
           <w:sz w:val="19"/>
         </w:rPr>
-        <w:t>1.409 mm</w:t>
+        <w:t>1.469 mm</w:t>
       </w:r>
       <w:r>
         <w:rPr>
@@ -169,7 +169,7 @@
           <w:color w:val="A8322C"/>
           <w:sz w:val="19"/>
         </w:rPr>
-        <w:t>17,8% abaixo</w:t>
+        <w:t>14,3% abaixo</w:t>
       </w:r>
       <w:r>
         <w:rPr>
@@ -179,7 +179,7 @@
           <w:color w:val="000000"/>
           <w:sz w:val="19"/>
         </w:rPr>
-        <w:t xml:space="preserve"> da média histórica de 1.714 mm (1981–2025), com 64,6% de probabilidade de ano seco. O núcleo chuvoso de dezembro a março permanece operacionalmente viável, com volumes </w:t>
+        <w:t xml:space="preserve"> da média histórica de 1.714 mm (1981–2025), com 51,6% de probabilidade de ano seco. O núcleo chuvoso de dezembro a março permanece operacionalmente viável, com volumes </w:t>
       </w:r>
       <w:r>
         <w:rPr>
@@ -189,7 +189,7 @@
           <w:color w:val="000000"/>
           <w:sz w:val="19"/>
         </w:rPr>
-        <w:t>12% a 19% menores que a climatologia.</w:t>
+        <w:t>64% a 99% menores que a climatologia.</w:t>
       </w:r>
     </w:p>
     <w:p>
@@ -587,7 +587,7 @@
                 <w:color w:val="A8322C"/>
                 <w:sz w:val="17"/>
               </w:rPr>
-              <w:t>1.409</w:t>
+              <w:t>1.469</w:t>
             </w:r>
           </w:p>
         </w:tc>
@@ -610,7 +610,7 @@
                 <w:color w:val="A8322C"/>
                 <w:sz w:val="17"/>
               </w:rPr>
-              <w:t>−17,8%</w:t>
+              <w:t>−14,3%</w:t>
             </w:r>
           </w:p>
         </w:tc>
@@ -633,7 +633,7 @@
                 <w:color w:val="A8322C"/>
                 <w:sz w:val="17"/>
               </w:rPr>
-              <w:t>64,6%</w:t>
+              <w:t>51,6%</w:t>
             </w:r>
           </w:p>
         </w:tc>
@@ -656,7 +656,7 @@
                 <w:color w:val="A8322C"/>
                 <w:sz w:val="17"/>
               </w:rPr>
-              <w:t>427</w:t>
+              <w:t>524</w:t>
             </w:r>
           </w:p>
         </w:tc>
@@ -724,7 +724,7 @@
                 <w:color w:val="000000"/>
                 <w:sz w:val="17"/>
               </w:rPr>
-              <w:t>1.491</w:t>
+              <w:t>1.540</w:t>
             </w:r>
           </w:p>
         </w:tc>
@@ -746,7 +746,7 @@
                 <w:color w:val="000000"/>
                 <w:sz w:val="17"/>
               </w:rPr>
-              <w:t>−13,0%</w:t>
+              <w:t>−10,2%</w:t>
             </w:r>
           </w:p>
         </w:tc>
@@ -768,7 +768,7 @@
                 <w:color w:val="000000"/>
                 <w:sz w:val="17"/>
               </w:rPr>
-              <w:t>45,6%</w:t>
+              <w:t>33,9%</w:t>
             </w:r>
           </w:p>
         </w:tc>
@@ -790,7 +790,7 @@
                 <w:color w:val="000000"/>
                 <w:sz w:val="17"/>
               </w:rPr>
-              <w:t>407</w:t>
+              <w:t>490</w:t>
             </w:r>
           </w:p>
         </w:tc>
@@ -812,7 +812,7 @@
                 <w:color w:val="000000"/>
                 <w:sz w:val="17"/>
               </w:rPr>
-              <w:t>6</w:t>
+              <w:t>5</w:t>
             </w:r>
           </w:p>
         </w:tc>
@@ -859,7 +859,7 @@
                 <w:color w:val="000000"/>
                 <w:sz w:val="17"/>
               </w:rPr>
-              <w:t>1.546</w:t>
+              <w:t>1.592</w:t>
             </w:r>
           </w:p>
         </w:tc>
@@ -882,7 +882,7 @@
                 <w:color w:val="000000"/>
                 <w:sz w:val="17"/>
               </w:rPr>
-              <w:t>−9,8%</w:t>
+              <w:t>−7,1%</w:t>
             </w:r>
           </w:p>
         </w:tc>
@@ -905,7 +905,7 @@
                 <w:color w:val="000000"/>
                 <w:sz w:val="17"/>
               </w:rPr>
-              <w:t>33,1%</w:t>
+              <w:t>24,8%</w:t>
             </w:r>
           </w:p>
         </w:tc>
@@ -928,7 +928,7 @@
                 <w:color w:val="000000"/>
                 <w:sz w:val="17"/>
               </w:rPr>
-              <w:t>395</w:t>
+              <w:t>464</w:t>
             </w:r>
           </w:p>
         </w:tc>
@@ -951,7 +951,7 @@
                 <w:color w:val="000000"/>
                 <w:sz w:val="17"/>
               </w:rPr>
-              <w:t>6</w:t>
+              <w:t>5</w:t>
             </w:r>
           </w:p>
         </w:tc>
@@ -996,7 +996,7 @@
                 <w:color w:val="000000"/>
                 <w:sz w:val="17"/>
               </w:rPr>
-              <w:t>1.636</w:t>
+              <w:t>1.682</w:t>
             </w:r>
           </w:p>
         </w:tc>
@@ -1018,7 +1018,7 @@
                 <w:color w:val="000000"/>
                 <w:sz w:val="17"/>
               </w:rPr>
-              <w:t>−4,6%</w:t>
+              <w:t>−1,9%</w:t>
             </w:r>
           </w:p>
         </w:tc>
@@ -1040,7 +1040,7 @@
                 <w:color w:val="000000"/>
                 <w:sz w:val="17"/>
               </w:rPr>
-              <w:t>16,1%</w:t>
+              <w:t>11,1%</w:t>
             </w:r>
           </w:p>
         </w:tc>
@@ -1062,7 +1062,7 @@
                 <w:color w:val="000000"/>
                 <w:sz w:val="17"/>
               </w:rPr>
-              <w:t>368</w:t>
+              <w:t>417</w:t>
             </w:r>
           </w:p>
         </w:tc>
@@ -1131,7 +1131,7 @@
                 <w:color w:val="000000"/>
                 <w:sz w:val="17"/>
               </w:rPr>
-              <w:t>1.736</w:t>
+              <w:t>1.786</w:t>
             </w:r>
           </w:p>
         </w:tc>
@@ -1154,7 +1154,7 @@
                 <w:color w:val="000000"/>
                 <w:sz w:val="17"/>
               </w:rPr>
-              <w:t>+1,3%</w:t>
+              <w:t>+4,2%</w:t>
             </w:r>
           </w:p>
         </w:tc>
@@ -1177,7 +1177,7 @@
                 <w:color w:val="000000"/>
                 <w:sz w:val="17"/>
               </w:rPr>
-              <w:t>4,5%</w:t>
+              <w:t>4,1%</w:t>
             </w:r>
           </w:p>
         </w:tc>
@@ -1200,7 +1200,7 @@
                 <w:color w:val="000000"/>
                 <w:sz w:val="17"/>
               </w:rPr>
-              <w:t>331</w:t>
+              <w:t>365</w:t>
             </w:r>
           </w:p>
         </w:tc>
@@ -1391,7 +1391,7 @@
           <w:color w:val="595959"/>
           <w:sz w:val="17"/>
         </w:rPr>
-        <w:t>o cenário central eleva o déficit anual em 56 mm sobrea climatologia e adiciona 2 meses de solo esgotado. O excedente hídrico cai de 619 mm para 370 mm — redução de 40% na recarga do perfil.</w:t>
+        <w:t>o cenário central eleva o déficit anual em 153 mm sobrea climatologia e adiciona 2 meses de solo esgotado. O excedente hídrico cai de 619 mm para 527 mm — redução de 15% na recarga do perfil.</w:t>
       </w:r>
     </w:p>
     <w:p>
@@ -1446,7 +1446,7 @@
           <w:color w:val="000000"/>
           <w:sz w:val="19"/>
         </w:rPr>
-        <w:t xml:space="preserve"> do horizonte — sendo a maior sequência contínua de 4 meses —, contra 4 na climatologia. </w:t>
+        <w:t xml:space="preserve"> do horizonte — sendo a maior sequência contínua de 6 meses —, contra 4 na climatologia. </w:t>
       </w:r>
       <w:r>
         <w:rPr>
@@ -1456,7 +1456,7 @@
           <w:color w:val="000000"/>
           <w:sz w:val="19"/>
         </w:rPr>
-        <w:t>Na entrada da estação chuvosa, outubro projeta 101 mm contra 120 mm da climatologia</w:t>
+        <w:t>Na entrada da estação chuvosa, outubro projeta 212 mm contra 120 mm da climatologia</w:t>
       </w:r>
       <w:r>
         <w:rPr>
@@ -1466,7 +1466,7 @@
           <w:color w:val="000000"/>
           <w:sz w:val="19"/>
         </w:rPr>
-        <w:t xml:space="preserve"> e novembro, 137 mm contra 159 mm</w:t>
+        <w:t xml:space="preserve"> e novembro, 64 mm contra 159 mm</w:t>
       </w:r>
       <w:r>
         <w:rPr>
@@ -2100,7 +2100,7 @@
           <w:color w:val="000000"/>
           <w:sz w:val="19"/>
         </w:rPr>
-        <w:t>Uma reclassificação do evento para El Niño moderado altera a projeção de 1.409 mm para 1.491 mm e a probabilidade de ano seco de 64,6% para 45,6%, o que redefine a postura da janela de transição.</w:t>
+        <w:t>Uma reclassificação do evento para El Niño moderado altera a projeção de 1.469 mm para 1.540 mm e a probabilidade de ano seco de 51,6% para 33,9%, o que redefine a postura da janela de transição.</w:t>
       </w:r>
     </w:p>
     <w:p>
@@ -2118,7 +2118,7 @@
           <w:color w:val="595959"/>
           <w:sz w:val="15"/>
         </w:rPr>
-        <w:t>Fontes: NOAA/CPC · IRI Columbia · NASA MERRA-2 · ECMWF ERA5-Land (Open-Meteo) · rede de estações Sinobras Florestal. Cenário central classificado pelo pico projetado do Niño 3.4 (2,55 °C). Documento gerado automaticamente em 12/08/2026.</w:t>
+        <w:t>Fontes: NOAA/CPC · IRI Columbia · NASA MERRA-2 · ECMWF ERA5-Land (Open-Meteo) · rede de estações Sinobras Florestal. Cenário central classificado pelo pico projetado do Niño 3.4 (2,55 °C). Documento gerado automaticamente em 13/08/2026.</w:t>
       </w:r>
     </w:p>
     <w:sectPr>

</xml_diff>

<commit_message>
auto: atualização dashboard — 13/08/2026 09:42 BRT
- Dados Open-Meteo ERA5-Land: 07/2026 incorporados
- Índices oceânicos atualizados (PSL/NOAA)
- SARIMAX x XGBoost comparados e melhor selecionado
- Cenários e BH recalculados
- Relatório executivo regerado
</commit_message>
<xml_diff>
--- a/docs/relatorio-executivo.docx
+++ b/docs/relatorio-executivo.docx
@@ -149,7 +149,7 @@
           <w:color w:val="A8322C"/>
           <w:sz w:val="19"/>
         </w:rPr>
-        <w:t>1.469 mm</w:t>
+        <w:t>1.470 mm</w:t>
       </w:r>
       <w:r>
         <w:rPr>
@@ -179,7 +179,7 @@
           <w:color w:val="000000"/>
           <w:sz w:val="19"/>
         </w:rPr>
-        <w:t xml:space="preserve"> da média histórica de 1.714 mm (1981–2025), com 51,6% de probabilidade de ano seco. O núcleo chuvoso de dezembro a março permanece operacionalmente viável, com volumes </w:t>
+        <w:t xml:space="preserve"> da média histórica de 1.714 mm (1981–2025), com 51,4% de probabilidade de ano seco. O núcleo chuvoso de dezembro a março permanece operacionalmente viável, com volumes </w:t>
       </w:r>
       <w:r>
         <w:rPr>
@@ -587,7 +587,7 @@
                 <w:color w:val="A8322C"/>
                 <w:sz w:val="17"/>
               </w:rPr>
-              <w:t>1.469</w:t>
+              <w:t>1.470</w:t>
             </w:r>
           </w:p>
         </w:tc>
@@ -633,7 +633,7 @@
                 <w:color w:val="A8322C"/>
                 <w:sz w:val="17"/>
               </w:rPr>
-              <w:t>51,6%</w:t>
+              <w:t>51,4%</w:t>
             </w:r>
           </w:p>
         </w:tc>
@@ -724,7 +724,7 @@
                 <w:color w:val="000000"/>
                 <w:sz w:val="17"/>
               </w:rPr>
-              <w:t>1.540</w:t>
+              <w:t>1.541</w:t>
             </w:r>
           </w:p>
         </w:tc>
@@ -746,7 +746,7 @@
                 <w:color w:val="000000"/>
                 <w:sz w:val="17"/>
               </w:rPr>
-              <w:t>−10,2%</w:t>
+              <w:t>−10,1%</w:t>
             </w:r>
           </w:p>
         </w:tc>
@@ -768,7 +768,7 @@
                 <w:color w:val="000000"/>
                 <w:sz w:val="17"/>
               </w:rPr>
-              <w:t>33,9%</w:t>
+              <w:t>34,0%</w:t>
             </w:r>
           </w:p>
         </w:tc>
@@ -905,7 +905,7 @@
                 <w:color w:val="000000"/>
                 <w:sz w:val="17"/>
               </w:rPr>
-              <w:t>24,8%</w:t>
+              <w:t>23,8%</w:t>
             </w:r>
           </w:p>
         </w:tc>
@@ -996,7 +996,7 @@
                 <w:color w:val="000000"/>
                 <w:sz w:val="17"/>
               </w:rPr>
-              <w:t>1.682</w:t>
+              <w:t>1.683</w:t>
             </w:r>
           </w:p>
         </w:tc>
@@ -1018,7 +1018,7 @@
                 <w:color w:val="000000"/>
                 <w:sz w:val="17"/>
               </w:rPr>
-              <w:t>−1,9%</w:t>
+              <w:t>−1,8%</w:t>
             </w:r>
           </w:p>
         </w:tc>
@@ -1040,7 +1040,7 @@
                 <w:color w:val="000000"/>
                 <w:sz w:val="17"/>
               </w:rPr>
-              <w:t>11,1%</w:t>
+              <w:t>11,5%</w:t>
             </w:r>
           </w:p>
         </w:tc>
@@ -1177,7 +1177,7 @@
                 <w:color w:val="000000"/>
                 <w:sz w:val="17"/>
               </w:rPr>
-              <w:t>4,1%</w:t>
+              <w:t>3,6%</w:t>
             </w:r>
           </w:p>
         </w:tc>
@@ -2100,7 +2100,7 @@
           <w:color w:val="000000"/>
           <w:sz w:val="19"/>
         </w:rPr>
-        <w:t>Uma reclassificação do evento para El Niño moderado altera a projeção de 1.469 mm para 1.540 mm e a probabilidade de ano seco de 51,6% para 33,9%, o que redefine a postura da janela de transição.</w:t>
+        <w:t>Uma reclassificação do evento para El Niño moderado altera a projeção de 1.470 mm para 1.541 mm e a probabilidade de ano seco de 51,4% para 34,0%, o que redefine a postura da janela de transição.</w:t>
       </w:r>
     </w:p>
     <w:p>

</xml_diff>

<commit_message>
auto: atualização dashboard — 21/08/2026 11:22 BRT
- Dados Open-Meteo ERA5-Land: 07/2026 incorporados
- Índices oceânicos atualizados (PSL/NOAA)
- SARIMAX x XGBoost comparados e melhor selecionado
- Cenários e BH recalculados
- Relatório executivo regerado
</commit_message>
<xml_diff>
--- a/docs/relatorio-executivo.docx
+++ b/docs/relatorio-executivo.docx
@@ -48,7 +48,7 @@
           <w:color w:val="595959"/>
           <w:sz w:val="17"/>
         </w:rPr>
-        <w:t>Norte do Tocantins  ·  Horizonte ago/2026 – jul/2027  ·  Emissão 13/08/2026</w:t>
+        <w:t>Norte do Tocantins  ·  Horizonte ago/2026 – jul/2027  ·  Emissão 21/08/2026</w:t>
       </w:r>
     </w:p>
     <w:p>
@@ -179,7 +179,7 @@
           <w:color w:val="000000"/>
           <w:sz w:val="19"/>
         </w:rPr>
-        <w:t xml:space="preserve"> da média histórica de 1.714 mm (1981–2025), com 51,4% de probabilidade de ano seco. O núcleo chuvoso de dezembro a março permanece operacionalmente viável, com volumes </w:t>
+        <w:t xml:space="preserve"> da média histórica de 1.714 mm (1981–2025), com 50,5% de probabilidade de ano seco. O núcleo chuvoso de dezembro a março permanece operacionalmente viável, com volumes </w:t>
       </w:r>
       <w:r>
         <w:rPr>
@@ -633,7 +633,7 @@
                 <w:color w:val="A8322C"/>
                 <w:sz w:val="17"/>
               </w:rPr>
-              <w:t>51,4%</w:t>
+              <w:t>50,5%</w:t>
             </w:r>
           </w:p>
         </w:tc>
@@ -768,7 +768,7 @@
                 <w:color w:val="000000"/>
                 <w:sz w:val="17"/>
               </w:rPr>
-              <w:t>34,0%</w:t>
+              <w:t>33,8%</w:t>
             </w:r>
           </w:p>
         </w:tc>
@@ -905,7 +905,7 @@
                 <w:color w:val="000000"/>
                 <w:sz w:val="17"/>
               </w:rPr>
-              <w:t>23,8%</w:t>
+              <w:t>24,4%</w:t>
             </w:r>
           </w:p>
         </w:tc>
@@ -1040,7 +1040,7 @@
                 <w:color w:val="000000"/>
                 <w:sz w:val="17"/>
               </w:rPr>
-              <w:t>11,5%</w:t>
+              <w:t>11,8%</w:t>
             </w:r>
           </w:p>
         </w:tc>
@@ -1177,7 +1177,7 @@
                 <w:color w:val="000000"/>
                 <w:sz w:val="17"/>
               </w:rPr>
-              <w:t>3,6%</w:t>
+              <w:t>3,9%</w:t>
             </w:r>
           </w:p>
         </w:tc>
@@ -2100,7 +2100,7 @@
           <w:color w:val="000000"/>
           <w:sz w:val="19"/>
         </w:rPr>
-        <w:t>Uma reclassificação do evento para El Niño moderado altera a projeção de 1.470 mm para 1.541 mm e a probabilidade de ano seco de 51,4% para 34,0%, o que redefine a postura da janela de transição.</w:t>
+        <w:t>Uma reclassificação do evento para El Niño moderado altera a projeção de 1.470 mm para 1.541 mm e a probabilidade de ano seco de 50,5% para 33,8%, o que redefine a postura da janela de transição.</w:t>
       </w:r>
     </w:p>
     <w:p>
@@ -2118,7 +2118,7 @@
           <w:color w:val="595959"/>
           <w:sz w:val="15"/>
         </w:rPr>
-        <w:t>Fontes: NOAA/CPC · IRI Columbia · NASA MERRA-2 · ECMWF ERA5-Land (Open-Meteo) · rede de estações Sinobras Florestal. Cenário central classificado pelo pico projetado do Niño 3.4 (2,55 °C). Documento gerado automaticamente em 13/08/2026.</w:t>
+        <w:t>Fontes: NOAA/CPC · IRI Columbia · NASA MERRA-2 · ECMWF ERA5-Land (Open-Meteo) · rede de estações Sinobras Florestal. Cenário central classificado pelo pico projetado do Niño 3.4 (2,55 °C). Documento gerado automaticamente em 21/08/2026.</w:t>
       </w:r>
     </w:p>
     <w:sectPr>

</xml_diff>

<commit_message>
auto: atualização dashboard — 21/08/2026 14:41 BRT
- Dados Open-Meteo ERA5-Land: 07/2026 incorporados
- Índices oceânicos atualizados (PSL/NOAA)
- SARIMAX x XGBoost comparados e melhor selecionado
- Cenários e BH recalculados
- Relatório executivo regerado
</commit_message>
<xml_diff>
--- a/docs/relatorio-executivo.docx
+++ b/docs/relatorio-executivo.docx
@@ -179,7 +179,7 @@
           <w:color w:val="000000"/>
           <w:sz w:val="19"/>
         </w:rPr>
-        <w:t xml:space="preserve"> da média histórica de 1.714 mm (1981–2025), com 50,5% de probabilidade de ano seco. O núcleo chuvoso de dezembro a março permanece operacionalmente viável, com volumes </w:t>
+        <w:t xml:space="preserve"> da média histórica de 1.714 mm (1981–2025), com 50,9% de probabilidade de ano seco. O núcleo chuvoso de dezembro a março permanece operacionalmente viável, com volumes </w:t>
       </w:r>
       <w:r>
         <w:rPr>
@@ -633,7 +633,7 @@
                 <w:color w:val="A8322C"/>
                 <w:sz w:val="17"/>
               </w:rPr>
-              <w:t>50,5%</w:t>
+              <w:t>50,9%</w:t>
             </w:r>
           </w:p>
         </w:tc>
@@ -656,7 +656,7 @@
                 <w:color w:val="A8322C"/>
                 <w:sz w:val="17"/>
               </w:rPr>
-              <w:t>524</w:t>
+              <w:t>476</w:t>
             </w:r>
           </w:p>
         </w:tc>
@@ -768,7 +768,7 @@
                 <w:color w:val="000000"/>
                 <w:sz w:val="17"/>
               </w:rPr>
-              <w:t>33,8%</w:t>
+              <w:t>32,6%</w:t>
             </w:r>
           </w:p>
         </w:tc>
@@ -790,7 +790,7 @@
                 <w:color w:val="000000"/>
                 <w:sz w:val="17"/>
               </w:rPr>
-              <w:t>490</w:t>
+              <w:t>440</w:t>
             </w:r>
           </w:p>
         </w:tc>
@@ -812,7 +812,7 @@
                 <w:color w:val="000000"/>
                 <w:sz w:val="17"/>
               </w:rPr>
-              <w:t>5</w:t>
+              <w:t>6</w:t>
             </w:r>
           </w:p>
         </w:tc>
@@ -905,7 +905,7 @@
                 <w:color w:val="000000"/>
                 <w:sz w:val="17"/>
               </w:rPr>
-              <w:t>24,4%</w:t>
+              <w:t>24,0%</w:t>
             </w:r>
           </w:p>
         </w:tc>
@@ -928,7 +928,7 @@
                 <w:color w:val="000000"/>
                 <w:sz w:val="17"/>
               </w:rPr>
-              <w:t>464</w:t>
+              <w:t>414</w:t>
             </w:r>
           </w:p>
         </w:tc>
@@ -1040,7 +1040,7 @@
                 <w:color w:val="000000"/>
                 <w:sz w:val="17"/>
               </w:rPr>
-              <w:t>11,8%</w:t>
+              <w:t>11,2%</w:t>
             </w:r>
           </w:p>
         </w:tc>
@@ -1062,7 +1062,7 @@
                 <w:color w:val="000000"/>
                 <w:sz w:val="17"/>
               </w:rPr>
-              <w:t>417</w:t>
+              <w:t>361</w:t>
             </w:r>
           </w:p>
         </w:tc>
@@ -1200,7 +1200,7 @@
                 <w:color w:val="000000"/>
                 <w:sz w:val="17"/>
               </w:rPr>
-              <w:t>365</w:t>
+              <w:t>308</w:t>
             </w:r>
           </w:p>
         </w:tc>
@@ -1391,7 +1391,7 @@
           <w:color w:val="595959"/>
           <w:sz w:val="17"/>
         </w:rPr>
-        <w:t>o cenário central eleva o déficit anual em 153 mm sobrea climatologia e adiciona 2 meses de solo esgotado. O excedente hídrico cai de 619 mm para 527 mm — redução de 15% na recarga do perfil.</w:t>
+        <w:t>o cenário central eleva o déficit anual em 105 mm sobrea climatologia e adiciona 2 meses de solo esgotado. O excedente hídrico cai de 619 mm para 479 mm — redução de 23% na recarga do perfil.</w:t>
       </w:r>
     </w:p>
     <w:p>
@@ -2100,7 +2100,7 @@
           <w:color w:val="000000"/>
           <w:sz w:val="19"/>
         </w:rPr>
-        <w:t>Uma reclassificação do evento para El Niño moderado altera a projeção de 1.470 mm para 1.541 mm e a probabilidade de ano seco de 50,5% para 33,8%, o que redefine a postura da janela de transição.</w:t>
+        <w:t>Uma reclassificação do evento para El Niño moderado altera a projeção de 1.470 mm para 1.541 mm e a probabilidade de ano seco de 50,9% para 32,6%, o que redefine a postura da janela de transição.</w:t>
       </w:r>
     </w:p>
     <w:p>

</xml_diff>

<commit_message>
auto: atualização dashboard — 21/08/2026 14:53 BRT
- Dados Open-Meteo ERA5-Land: 07/2026 incorporados
- Índices oceânicos atualizados (PSL/NOAA)
- SARIMAX x XGBoost comparados e melhor selecionado
- Cenários e BH recalculados
- Relatório executivo regerado
</commit_message>
<xml_diff>
--- a/docs/relatorio-executivo.docx
+++ b/docs/relatorio-executivo.docx
@@ -149,7 +149,7 @@
           <w:color w:val="A8322C"/>
           <w:sz w:val="19"/>
         </w:rPr>
-        <w:t>1.409 mm</w:t>
+        <w:t>1.470 mm</w:t>
       </w:r>
       <w:r>
         <w:rPr>
@@ -169,7 +169,7 @@
           <w:color w:val="A8322C"/>
           <w:sz w:val="19"/>
         </w:rPr>
-        <w:t>17,8% abaixo</w:t>
+        <w:t>14,3% abaixo</w:t>
       </w:r>
       <w:r>
         <w:rPr>
@@ -179,7 +179,7 @@
           <w:color w:val="000000"/>
           <w:sz w:val="19"/>
         </w:rPr>
-        <w:t xml:space="preserve"> da média histórica de 1.714 mm (1981–2025), com 65,9% de probabilidade de ano seco. O núcleo chuvoso de dezembro a março permanece operacionalmente viável, com volumes </w:t>
+        <w:t xml:space="preserve"> da média histórica de 1.714 mm (1981–2025), com 51,9% de probabilidade de ano seco. O núcleo chuvoso de dezembro a março permanece operacionalmente viável, com volumes </w:t>
       </w:r>
       <w:r>
         <w:rPr>
@@ -189,7 +189,7 @@
           <w:color w:val="000000"/>
           <w:sz w:val="19"/>
         </w:rPr>
-        <w:t>12% a 19% menores que a climatologia.</w:t>
+        <w:t>64% a 99% menores que a climatologia.</w:t>
       </w:r>
     </w:p>
     <w:p>
@@ -587,7 +587,7 @@
                 <w:color w:val="A8322C"/>
                 <w:sz w:val="17"/>
               </w:rPr>
-              <w:t>1.409</w:t>
+              <w:t>1.470</w:t>
             </w:r>
           </w:p>
         </w:tc>
@@ -610,7 +610,7 @@
                 <w:color w:val="A8322C"/>
                 <w:sz w:val="17"/>
               </w:rPr>
-              <w:t>−17,8%</w:t>
+              <w:t>−14,3%</w:t>
             </w:r>
           </w:p>
         </w:tc>
@@ -633,7 +633,7 @@
                 <w:color w:val="A8322C"/>
                 <w:sz w:val="17"/>
               </w:rPr>
-              <w:t>65,9%</w:t>
+              <w:t>51,9%</w:t>
             </w:r>
           </w:p>
         </w:tc>
@@ -656,7 +656,7 @@
                 <w:color w:val="A8322C"/>
                 <w:sz w:val="17"/>
               </w:rPr>
-              <w:t>477</w:t>
+              <w:t>476</w:t>
             </w:r>
           </w:p>
         </w:tc>
@@ -724,7 +724,7 @@
                 <w:color w:val="000000"/>
                 <w:sz w:val="17"/>
               </w:rPr>
-              <w:t>1.491</w:t>
+              <w:t>1.541</w:t>
             </w:r>
           </w:p>
         </w:tc>
@@ -746,7 +746,7 @@
                 <w:color w:val="000000"/>
                 <w:sz w:val="17"/>
               </w:rPr>
-              <w:t>−13,0%</w:t>
+              <w:t>−10,1%</w:t>
             </w:r>
           </w:p>
         </w:tc>
@@ -768,7 +768,7 @@
                 <w:color w:val="000000"/>
                 <w:sz w:val="17"/>
               </w:rPr>
-              <w:t>45,9%</w:t>
+              <w:t>33,5%</w:t>
             </w:r>
           </w:p>
         </w:tc>
@@ -790,7 +790,7 @@
                 <w:color w:val="000000"/>
                 <w:sz w:val="17"/>
               </w:rPr>
-              <w:t>457</w:t>
+              <w:t>440</w:t>
             </w:r>
           </w:p>
         </w:tc>
@@ -859,7 +859,7 @@
                 <w:color w:val="000000"/>
                 <w:sz w:val="17"/>
               </w:rPr>
-              <w:t>1.546</w:t>
+              <w:t>1.592</w:t>
             </w:r>
           </w:p>
         </w:tc>
@@ -882,7 +882,7 @@
                 <w:color w:val="000000"/>
                 <w:sz w:val="17"/>
               </w:rPr>
-              <w:t>−9,8%</w:t>
+              <w:t>−7,1%</w:t>
             </w:r>
           </w:p>
         </w:tc>
@@ -905,7 +905,7 @@
                 <w:color w:val="000000"/>
                 <w:sz w:val="17"/>
               </w:rPr>
-              <w:t>33,4%</w:t>
+              <w:t>23,8%</w:t>
             </w:r>
           </w:p>
         </w:tc>
@@ -928,7 +928,7 @@
                 <w:color w:val="000000"/>
                 <w:sz w:val="17"/>
               </w:rPr>
-              <w:t>444</w:t>
+              <w:t>414</w:t>
             </w:r>
           </w:p>
         </w:tc>
@@ -951,7 +951,7 @@
                 <w:color w:val="000000"/>
                 <w:sz w:val="17"/>
               </w:rPr>
-              <w:t>6</w:t>
+              <w:t>5</w:t>
             </w:r>
           </w:p>
         </w:tc>
@@ -996,7 +996,7 @@
                 <w:color w:val="000000"/>
                 <w:sz w:val="17"/>
               </w:rPr>
-              <w:t>1.636</w:t>
+              <w:t>1.683</w:t>
             </w:r>
           </w:p>
         </w:tc>
@@ -1018,7 +1018,7 @@
                 <w:color w:val="000000"/>
                 <w:sz w:val="17"/>
               </w:rPr>
-              <w:t>−4,6%</w:t>
+              <w:t>−1,8%</w:t>
             </w:r>
           </w:p>
         </w:tc>
@@ -1040,7 +1040,7 @@
                 <w:color w:val="000000"/>
                 <w:sz w:val="17"/>
               </w:rPr>
-              <w:t>16,6%</w:t>
+              <w:t>11,2%</w:t>
             </w:r>
           </w:p>
         </w:tc>
@@ -1062,7 +1062,7 @@
                 <w:color w:val="000000"/>
                 <w:sz w:val="17"/>
               </w:rPr>
-              <w:t>417</w:t>
+              <w:t>361</w:t>
             </w:r>
           </w:p>
         </w:tc>
@@ -1131,7 +1131,7 @@
                 <w:color w:val="000000"/>
                 <w:sz w:val="17"/>
               </w:rPr>
-              <w:t>1.736</w:t>
+              <w:t>1.786</w:t>
             </w:r>
           </w:p>
         </w:tc>
@@ -1154,7 +1154,7 @@
                 <w:color w:val="000000"/>
                 <w:sz w:val="17"/>
               </w:rPr>
-              <w:t>+1,3%</w:t>
+              <w:t>+4,2%</w:t>
             </w:r>
           </w:p>
         </w:tc>
@@ -1177,7 +1177,7 @@
                 <w:color w:val="000000"/>
                 <w:sz w:val="17"/>
               </w:rPr>
-              <w:t>4,5%</w:t>
+              <w:t>4,4%</w:t>
             </w:r>
           </w:p>
         </w:tc>
@@ -1200,7 +1200,7 @@
                 <w:color w:val="000000"/>
                 <w:sz w:val="17"/>
               </w:rPr>
-              <w:t>381</w:t>
+              <w:t>308</w:t>
             </w:r>
           </w:p>
         </w:tc>
@@ -1391,7 +1391,7 @@
           <w:color w:val="595959"/>
           <w:sz w:val="17"/>
         </w:rPr>
-        <w:t>o cenário central eleva o déficit anual em 106 mm sobrea climatologia e adiciona 2 meses de solo esgotado. O excedente hídrico cai de 619 mm para 420 mm — redução de 32% na recarga do perfil.</w:t>
+        <w:t>o cenário central eleva o déficit anual em 105 mm sobrea climatologia e adiciona 2 meses de solo esgotado. O excedente hídrico cai de 619 mm para 479 mm — redução de 23% na recarga do perfil.</w:t>
       </w:r>
     </w:p>
     <w:p>
@@ -1446,7 +1446,7 @@
           <w:color w:val="000000"/>
           <w:sz w:val="19"/>
         </w:rPr>
-        <w:t xml:space="preserve"> do horizonte — sendo a maior sequência contínua de 4 meses —, contra 4 na climatologia. </w:t>
+        <w:t xml:space="preserve"> do horizonte — sendo a maior sequência contínua de 6 meses —, contra 4 na climatologia. </w:t>
       </w:r>
       <w:r>
         <w:rPr>
@@ -1456,7 +1456,7 @@
           <w:color w:val="000000"/>
           <w:sz w:val="19"/>
         </w:rPr>
-        <w:t>Na entrada da estação chuvosa, outubro projeta 101 mm contra 120 mm da climatologia</w:t>
+        <w:t>Na entrada da estação chuvosa, outubro projeta 212 mm contra 120 mm da climatologia</w:t>
       </w:r>
       <w:r>
         <w:rPr>
@@ -1466,7 +1466,7 @@
           <w:color w:val="000000"/>
           <w:sz w:val="19"/>
         </w:rPr>
-        <w:t xml:space="preserve"> e novembro, 137 mm contra 159 mm</w:t>
+        <w:t xml:space="preserve"> e novembro, 64 mm contra 159 mm</w:t>
       </w:r>
       <w:r>
         <w:rPr>
@@ -2100,7 +2100,7 @@
           <w:color w:val="000000"/>
           <w:sz w:val="19"/>
         </w:rPr>
-        <w:t>Uma reclassificação do evento para El Niño moderado altera a projeção de 1.409 mm para 1.491 mm e a probabilidade de ano seco de 65,9% para 45,9%, o que redefine a postura da janela de transição.</w:t>
+        <w:t>Uma reclassificação do evento para El Niño moderado altera a projeção de 1.470 mm para 1.541 mm e a probabilidade de ano seco de 51,9% para 33,5%, o que redefine a postura da janela de transição.</w:t>
       </w:r>
     </w:p>
     <w:p>

</xml_diff>

<commit_message>
auto: atualização dashboard — 21/08/2026 15:33 BRT
- Dados Open-Meteo ERA5-Land: 07/2026 incorporados
- Índices oceânicos atualizados (PSL/NOAA)
- SARIMAX x XGBoost comparados e melhor selecionado
- Cenários e BH recalculados
- Relatório executivo regerado
</commit_message>
<xml_diff>
--- a/docs/relatorio-executivo.docx
+++ b/docs/relatorio-executivo.docx
@@ -149,7 +149,7 @@
           <w:color w:val="A8322C"/>
           <w:sz w:val="19"/>
         </w:rPr>
-        <w:t>1.409 mm</w:t>
+        <w:t>1.470 mm</w:t>
       </w:r>
       <w:r>
         <w:rPr>
@@ -169,7 +169,7 @@
           <w:color w:val="A8322C"/>
           <w:sz w:val="19"/>
         </w:rPr>
-        <w:t>17,8% abaixo</w:t>
+        <w:t>14,3% abaixo</w:t>
       </w:r>
       <w:r>
         <w:rPr>
@@ -179,7 +179,7 @@
           <w:color w:val="000000"/>
           <w:sz w:val="19"/>
         </w:rPr>
-        <w:t xml:space="preserve"> da média histórica de 1.714 mm (1981–2025), com 65,9% de probabilidade de ano seco. O núcleo chuvoso de dezembro a março permanece operacionalmente viável, com volumes </w:t>
+        <w:t xml:space="preserve"> da média histórica de 1.714 mm (1981–2025), com 51,5% de probabilidade de ano seco. O núcleo chuvoso de dezembro a março permanece operacionalmente viável, com volumes </w:t>
       </w:r>
       <w:r>
         <w:rPr>
@@ -189,7 +189,7 @@
           <w:color w:val="000000"/>
           <w:sz w:val="19"/>
         </w:rPr>
-        <w:t>12% a 19% menores que a climatologia.</w:t>
+        <w:t>64% a 99% menores que a climatologia.</w:t>
       </w:r>
     </w:p>
     <w:p>
@@ -587,7 +587,7 @@
                 <w:color w:val="A8322C"/>
                 <w:sz w:val="17"/>
               </w:rPr>
-              <w:t>1.409</w:t>
+              <w:t>1.470</w:t>
             </w:r>
           </w:p>
         </w:tc>
@@ -610,7 +610,7 @@
                 <w:color w:val="A8322C"/>
                 <w:sz w:val="17"/>
               </w:rPr>
-              <w:t>−17,8%</w:t>
+              <w:t>−14,3%</w:t>
             </w:r>
           </w:p>
         </w:tc>
@@ -633,7 +633,7 @@
                 <w:color w:val="A8322C"/>
                 <w:sz w:val="17"/>
               </w:rPr>
-              <w:t>65,9%</w:t>
+              <w:t>51,5%</w:t>
             </w:r>
           </w:p>
         </w:tc>
@@ -656,7 +656,7 @@
                 <w:color w:val="A8322C"/>
                 <w:sz w:val="17"/>
               </w:rPr>
-              <w:t>477</w:t>
+              <w:t>476</w:t>
             </w:r>
           </w:p>
         </w:tc>
@@ -724,7 +724,7 @@
                 <w:color w:val="000000"/>
                 <w:sz w:val="17"/>
               </w:rPr>
-              <w:t>1.491</w:t>
+              <w:t>1.541</w:t>
             </w:r>
           </w:p>
         </w:tc>
@@ -746,7 +746,7 @@
                 <w:color w:val="000000"/>
                 <w:sz w:val="17"/>
               </w:rPr>
-              <w:t>−13,0%</w:t>
+              <w:t>−10,1%</w:t>
             </w:r>
           </w:p>
         </w:tc>
@@ -768,7 +768,7 @@
                 <w:color w:val="000000"/>
                 <w:sz w:val="17"/>
               </w:rPr>
-              <w:t>45,9%</w:t>
+              <w:t>33,1%</w:t>
             </w:r>
           </w:p>
         </w:tc>
@@ -790,7 +790,7 @@
                 <w:color w:val="000000"/>
                 <w:sz w:val="17"/>
               </w:rPr>
-              <w:t>457</w:t>
+              <w:t>440</w:t>
             </w:r>
           </w:p>
         </w:tc>
@@ -859,7 +859,7 @@
                 <w:color w:val="000000"/>
                 <w:sz w:val="17"/>
               </w:rPr>
-              <w:t>1.546</w:t>
+              <w:t>1.592</w:t>
             </w:r>
           </w:p>
         </w:tc>
@@ -882,7 +882,7 @@
                 <w:color w:val="000000"/>
                 <w:sz w:val="17"/>
               </w:rPr>
-              <w:t>−9,8%</w:t>
+              <w:t>−7,1%</w:t>
             </w:r>
           </w:p>
         </w:tc>
@@ -905,7 +905,7 @@
                 <w:color w:val="000000"/>
                 <w:sz w:val="17"/>
               </w:rPr>
-              <w:t>33,4%</w:t>
+              <w:t>24,1%</w:t>
             </w:r>
           </w:p>
         </w:tc>
@@ -928,7 +928,7 @@
                 <w:color w:val="000000"/>
                 <w:sz w:val="17"/>
               </w:rPr>
-              <w:t>444</w:t>
+              <w:t>414</w:t>
             </w:r>
           </w:p>
         </w:tc>
@@ -951,7 +951,7 @@
                 <w:color w:val="000000"/>
                 <w:sz w:val="17"/>
               </w:rPr>
-              <w:t>6</w:t>
+              <w:t>5</w:t>
             </w:r>
           </w:p>
         </w:tc>
@@ -996,7 +996,7 @@
                 <w:color w:val="000000"/>
                 <w:sz w:val="17"/>
               </w:rPr>
-              <w:t>1.636</w:t>
+              <w:t>1.683</w:t>
             </w:r>
           </w:p>
         </w:tc>
@@ -1018,7 +1018,7 @@
                 <w:color w:val="000000"/>
                 <w:sz w:val="17"/>
               </w:rPr>
-              <w:t>−4,6%</w:t>
+              <w:t>−1,8%</w:t>
             </w:r>
           </w:p>
         </w:tc>
@@ -1040,7 +1040,7 @@
                 <w:color w:val="000000"/>
                 <w:sz w:val="17"/>
               </w:rPr>
-              <w:t>16,6%</w:t>
+              <w:t>11,6%</w:t>
             </w:r>
           </w:p>
         </w:tc>
@@ -1062,7 +1062,7 @@
                 <w:color w:val="000000"/>
                 <w:sz w:val="17"/>
               </w:rPr>
-              <w:t>417</w:t>
+              <w:t>361</w:t>
             </w:r>
           </w:p>
         </w:tc>
@@ -1131,7 +1131,7 @@
                 <w:color w:val="000000"/>
                 <w:sz w:val="17"/>
               </w:rPr>
-              <w:t>1.736</w:t>
+              <w:t>1.786</w:t>
             </w:r>
           </w:p>
         </w:tc>
@@ -1154,7 +1154,7 @@
                 <w:color w:val="000000"/>
                 <w:sz w:val="17"/>
               </w:rPr>
-              <w:t>+1,3%</w:t>
+              <w:t>+4,2%</w:t>
             </w:r>
           </w:p>
         </w:tc>
@@ -1177,7 +1177,7 @@
                 <w:color w:val="000000"/>
                 <w:sz w:val="17"/>
               </w:rPr>
-              <w:t>4,5%</w:t>
+              <w:t>3,6%</w:t>
             </w:r>
           </w:p>
         </w:tc>
@@ -1200,7 +1200,7 @@
                 <w:color w:val="000000"/>
                 <w:sz w:val="17"/>
               </w:rPr>
-              <w:t>381</w:t>
+              <w:t>308</w:t>
             </w:r>
           </w:p>
         </w:tc>
@@ -1391,7 +1391,7 @@
           <w:color w:val="595959"/>
           <w:sz w:val="17"/>
         </w:rPr>
-        <w:t>o cenário central eleva o déficit anual em 106 mm sobrea climatologia e adiciona 2 meses de solo esgotado. O excedente hídrico cai de 619 mm para 420 mm — redução de 32% na recarga do perfil.</w:t>
+        <w:t>o cenário central eleva o déficit anual em 105 mm sobrea climatologia e adiciona 2 meses de solo esgotado. O excedente hídrico cai de 619 mm para 479 mm — redução de 23% na recarga do perfil.</w:t>
       </w:r>
     </w:p>
     <w:p>
@@ -1446,7 +1446,7 @@
           <w:color w:val="000000"/>
           <w:sz w:val="19"/>
         </w:rPr>
-        <w:t xml:space="preserve"> do horizonte — sendo a maior sequência contínua de 4 meses —, contra 4 na climatologia. </w:t>
+        <w:t xml:space="preserve"> do horizonte — sendo a maior sequência contínua de 6 meses —, contra 4 na climatologia. </w:t>
       </w:r>
       <w:r>
         <w:rPr>
@@ -1456,7 +1456,7 @@
           <w:color w:val="000000"/>
           <w:sz w:val="19"/>
         </w:rPr>
-        <w:t>Na entrada da estação chuvosa, outubro projeta 101 mm contra 120 mm da climatologia</w:t>
+        <w:t>Na entrada da estação chuvosa, outubro projeta 212 mm contra 120 mm da climatologia</w:t>
       </w:r>
       <w:r>
         <w:rPr>
@@ -1466,7 +1466,7 @@
           <w:color w:val="000000"/>
           <w:sz w:val="19"/>
         </w:rPr>
-        <w:t xml:space="preserve"> e novembro, 137 mm contra 159 mm</w:t>
+        <w:t xml:space="preserve"> e novembro, 64 mm contra 159 mm</w:t>
       </w:r>
       <w:r>
         <w:rPr>
@@ -2100,7 +2100,7 @@
           <w:color w:val="000000"/>
           <w:sz w:val="19"/>
         </w:rPr>
-        <w:t>Uma reclassificação do evento para El Niño moderado altera a projeção de 1.409 mm para 1.491 mm e a probabilidade de ano seco de 65,9% para 45,9%, o que redefine a postura da janela de transição.</w:t>
+        <w:t>Uma reclassificação do evento para El Niño moderado altera a projeção de 1.470 mm para 1.541 mm e a probabilidade de ano seco de 51,5% para 33,1%, o que redefine a postura da janela de transição.</w:t>
       </w:r>
     </w:p>
     <w:p>

</xml_diff>

<commit_message>
auto: atualização dashboard — 21/08/2026 16:08 BRT
- Dados Open-Meteo ERA5-Land: 07/2026 incorporados
- Índices oceânicos atualizados (PSL/NOAA)
- SARIMAX x XGBoost comparados e melhor selecionado
- Cenários e BH recalculados
- Relatório executivo regerado
</commit_message>
<xml_diff>
--- a/docs/relatorio-executivo.docx
+++ b/docs/relatorio-executivo.docx
@@ -149,7 +149,7 @@
           <w:color w:val="A8322C"/>
           <w:sz w:val="19"/>
         </w:rPr>
-        <w:t>1.409 mm</w:t>
+        <w:t>1.469 mm</w:t>
       </w:r>
       <w:r>
         <w:rPr>
@@ -169,7 +169,7 @@
           <w:color w:val="A8322C"/>
           <w:sz w:val="19"/>
         </w:rPr>
-        <w:t>17,8% abaixo</w:t>
+        <w:t>14,3% abaixo</w:t>
       </w:r>
       <w:r>
         <w:rPr>
@@ -179,7 +179,7 @@
           <w:color w:val="000000"/>
           <w:sz w:val="19"/>
         </w:rPr>
-        <w:t xml:space="preserve"> da média histórica de 1.714 mm (1981–2025), com 66,9% de probabilidade de ano seco. O núcleo chuvoso de dezembro a março permanece operacionalmente viável, com volumes </w:t>
+        <w:t xml:space="preserve"> da média histórica de 1.714 mm (1981–2025), com 52,1% de probabilidade de ano seco. O núcleo chuvoso de dezembro a março permanece operacionalmente viável, com volumes </w:t>
       </w:r>
       <w:r>
         <w:rPr>
@@ -189,7 +189,7 @@
           <w:color w:val="000000"/>
           <w:sz w:val="19"/>
         </w:rPr>
-        <w:t>12% a 19% menores que a climatologia.</w:t>
+        <w:t>64% a 99% menores que a climatologia.</w:t>
       </w:r>
     </w:p>
     <w:p>
@@ -587,7 +587,7 @@
                 <w:color w:val="A8322C"/>
                 <w:sz w:val="17"/>
               </w:rPr>
-              <w:t>1.409</w:t>
+              <w:t>1.469</w:t>
             </w:r>
           </w:p>
         </w:tc>
@@ -610,7 +610,7 @@
                 <w:color w:val="A8322C"/>
                 <w:sz w:val="17"/>
               </w:rPr>
-              <w:t>−17,8%</w:t>
+              <w:t>−14,3%</w:t>
             </w:r>
           </w:p>
         </w:tc>
@@ -633,7 +633,7 @@
                 <w:color w:val="A8322C"/>
                 <w:sz w:val="17"/>
               </w:rPr>
-              <w:t>66,9%</w:t>
+              <w:t>52,1%</w:t>
             </w:r>
           </w:p>
         </w:tc>
@@ -656,7 +656,7 @@
                 <w:color w:val="A8322C"/>
                 <w:sz w:val="17"/>
               </w:rPr>
-              <w:t>477</w:t>
+              <w:t>476</w:t>
             </w:r>
           </w:p>
         </w:tc>
@@ -724,7 +724,7 @@
                 <w:color w:val="000000"/>
                 <w:sz w:val="17"/>
               </w:rPr>
-              <w:t>1.491</w:t>
+              <w:t>1.540</w:t>
             </w:r>
           </w:p>
         </w:tc>
@@ -746,7 +746,7 @@
                 <w:color w:val="000000"/>
                 <w:sz w:val="17"/>
               </w:rPr>
-              <w:t>−13,0%</w:t>
+              <w:t>−10,2%</w:t>
             </w:r>
           </w:p>
         </w:tc>
@@ -768,7 +768,7 @@
                 <w:color w:val="000000"/>
                 <w:sz w:val="17"/>
               </w:rPr>
-              <w:t>45,9%</w:t>
+              <w:t>34,2%</w:t>
             </w:r>
           </w:p>
         </w:tc>
@@ -790,7 +790,7 @@
                 <w:color w:val="000000"/>
                 <w:sz w:val="17"/>
               </w:rPr>
-              <w:t>457</w:t>
+              <w:t>440</w:t>
             </w:r>
           </w:p>
         </w:tc>
@@ -859,7 +859,7 @@
                 <w:color w:val="000000"/>
                 <w:sz w:val="17"/>
               </w:rPr>
-              <w:t>1.546</w:t>
+              <w:t>1.592</w:t>
             </w:r>
           </w:p>
         </w:tc>
@@ -882,7 +882,7 @@
                 <w:color w:val="000000"/>
                 <w:sz w:val="17"/>
               </w:rPr>
-              <w:t>−9,8%</w:t>
+              <w:t>−7,1%</w:t>
             </w:r>
           </w:p>
         </w:tc>
@@ -905,7 +905,7 @@
                 <w:color w:val="000000"/>
                 <w:sz w:val="17"/>
               </w:rPr>
-              <w:t>34,2%</w:t>
+              <w:t>23,8%</w:t>
             </w:r>
           </w:p>
         </w:tc>
@@ -928,7 +928,7 @@
                 <w:color w:val="000000"/>
                 <w:sz w:val="17"/>
               </w:rPr>
-              <w:t>444</w:t>
+              <w:t>414</w:t>
             </w:r>
           </w:p>
         </w:tc>
@@ -951,7 +951,7 @@
                 <w:color w:val="000000"/>
                 <w:sz w:val="17"/>
               </w:rPr>
-              <w:t>6</w:t>
+              <w:t>5</w:t>
             </w:r>
           </w:p>
         </w:tc>
@@ -996,7 +996,7 @@
                 <w:color w:val="000000"/>
                 <w:sz w:val="17"/>
               </w:rPr>
-              <w:t>1.636</w:t>
+              <w:t>1.682</w:t>
             </w:r>
           </w:p>
         </w:tc>
@@ -1018,7 +1018,7 @@
                 <w:color w:val="000000"/>
                 <w:sz w:val="17"/>
               </w:rPr>
-              <w:t>−4,6%</w:t>
+              <w:t>−1,9%</w:t>
             </w:r>
           </w:p>
         </w:tc>
@@ -1040,7 +1040,7 @@
                 <w:color w:val="000000"/>
                 <w:sz w:val="17"/>
               </w:rPr>
-              <w:t>16,2%</w:t>
+              <w:t>11,5%</w:t>
             </w:r>
           </w:p>
         </w:tc>
@@ -1062,7 +1062,7 @@
                 <w:color w:val="000000"/>
                 <w:sz w:val="17"/>
               </w:rPr>
-              <w:t>417</w:t>
+              <w:t>361</w:t>
             </w:r>
           </w:p>
         </w:tc>
@@ -1131,7 +1131,7 @@
                 <w:color w:val="000000"/>
                 <w:sz w:val="17"/>
               </w:rPr>
-              <w:t>1.736</w:t>
+              <w:t>1.786</w:t>
             </w:r>
           </w:p>
         </w:tc>
@@ -1154,7 +1154,7 @@
                 <w:color w:val="000000"/>
                 <w:sz w:val="17"/>
               </w:rPr>
-              <w:t>+1,3%</w:t>
+              <w:t>+4,2%</w:t>
             </w:r>
           </w:p>
         </w:tc>
@@ -1177,7 +1177,7 @@
                 <w:color w:val="000000"/>
                 <w:sz w:val="17"/>
               </w:rPr>
-              <w:t>4,8%</w:t>
+              <w:t>4,1%</w:t>
             </w:r>
           </w:p>
         </w:tc>
@@ -1200,7 +1200,7 @@
                 <w:color w:val="000000"/>
                 <w:sz w:val="17"/>
               </w:rPr>
-              <w:t>381</w:t>
+              <w:t>308</w:t>
             </w:r>
           </w:p>
         </w:tc>
@@ -1391,7 +1391,7 @@
           <w:color w:val="595959"/>
           <w:sz w:val="17"/>
         </w:rPr>
-        <w:t>o cenário central eleva o déficit anual em 106 mm sobrea climatologia e adiciona 2 meses de solo esgotado. O excedente hídrico cai de 619 mm para 420 mm — redução de 32% na recarga do perfil.</w:t>
+        <w:t>o cenário central eleva o déficit anual em 105 mm sobrea climatologia e adiciona 2 meses de solo esgotado. O excedente hídrico cai de 619 mm para 479 mm — redução de 23% na recarga do perfil.</w:t>
       </w:r>
     </w:p>
     <w:p>
@@ -1446,7 +1446,7 @@
           <w:color w:val="000000"/>
           <w:sz w:val="19"/>
         </w:rPr>
-        <w:t xml:space="preserve"> do horizonte — sendo a maior sequência contínua de 4 meses —, contra 4 na climatologia. </w:t>
+        <w:t xml:space="preserve"> do horizonte — sendo a maior sequência contínua de 6 meses —, contra 4 na climatologia. </w:t>
       </w:r>
       <w:r>
         <w:rPr>
@@ -1456,7 +1456,7 @@
           <w:color w:val="000000"/>
           <w:sz w:val="19"/>
         </w:rPr>
-        <w:t>Na entrada da estação chuvosa, outubro projeta 101 mm contra 120 mm da climatologia</w:t>
+        <w:t>Na entrada da estação chuvosa, outubro projeta 212 mm contra 120 mm da climatologia</w:t>
       </w:r>
       <w:r>
         <w:rPr>
@@ -1466,7 +1466,7 @@
           <w:color w:val="000000"/>
           <w:sz w:val="19"/>
         </w:rPr>
-        <w:t xml:space="preserve"> e novembro, 137 mm contra 159 mm</w:t>
+        <w:t xml:space="preserve"> e novembro, 64 mm contra 159 mm</w:t>
       </w:r>
       <w:r>
         <w:rPr>
@@ -2100,7 +2100,7 @@
           <w:color w:val="000000"/>
           <w:sz w:val="19"/>
         </w:rPr>
-        <w:t>Uma reclassificação do evento para El Niño moderado altera a projeção de 1.409 mm para 1.491 mm e a probabilidade de ano seco de 66,9% para 45,9%, o que redefine a postura da janela de transição.</w:t>
+        <w:t>Uma reclassificação do evento para El Niño moderado altera a projeção de 1.469 mm para 1.540 mm e a probabilidade de ano seco de 52,1% para 34,2%, o que redefine a postura da janela de transição.</w:t>
       </w:r>
     </w:p>
     <w:p>

</xml_diff>

<commit_message>
auto: atualização dashboard — 24/08/2026 08:36 BRT
- Dados Open-Meteo ERA5-Land: 07/2026 incorporados
- Índices oceânicos atualizados (PSL/NOAA)
- SARIMAX x XGBoost comparados e melhor selecionado
- Cenários e BH recalculados
- Relatório executivo regerado
</commit_message>
<xml_diff>
--- a/docs/relatorio-executivo.docx
+++ b/docs/relatorio-executivo.docx
@@ -48,7 +48,7 @@
           <w:color w:val="595959"/>
           <w:sz w:val="17"/>
         </w:rPr>
-        <w:t>Norte do Tocantins  ·  Horizonte ago/2026 – jul/2027  ·  Emissão 21/08/2026</w:t>
+        <w:t>Norte do Tocantins  ·  Horizonte ago/2026 – jul/2027  ·  Emissão 24/08/2026</w:t>
       </w:r>
     </w:p>
     <w:p>
@@ -149,7 +149,7 @@
           <w:color w:val="A8322C"/>
           <w:sz w:val="19"/>
         </w:rPr>
-        <w:t>1.469 mm</w:t>
+        <w:t>1.470 mm</w:t>
       </w:r>
       <w:r>
         <w:rPr>
@@ -179,7 +179,7 @@
           <w:color w:val="000000"/>
           <w:sz w:val="19"/>
         </w:rPr>
-        <w:t xml:space="preserve"> da média histórica de 1.714 mm (1981–2025), com 52,1% de probabilidade de ano seco. O núcleo chuvoso de dezembro a março permanece operacionalmente viável, com volumes </w:t>
+        <w:t xml:space="preserve"> da média histórica de 1.714 mm (1981–2025), com 51,4% de probabilidade de ano seco. O núcleo chuvoso de dezembro a março permanece operacionalmente viável, com volumes </w:t>
       </w:r>
       <w:r>
         <w:rPr>
@@ -587,7 +587,7 @@
                 <w:color w:val="A8322C"/>
                 <w:sz w:val="17"/>
               </w:rPr>
-              <w:t>1.469</w:t>
+              <w:t>1.470</w:t>
             </w:r>
           </w:p>
         </w:tc>
@@ -633,7 +633,7 @@
                 <w:color w:val="A8322C"/>
                 <w:sz w:val="17"/>
               </w:rPr>
-              <w:t>52,1%</w:t>
+              <w:t>51,4%</w:t>
             </w:r>
           </w:p>
         </w:tc>
@@ -724,7 +724,7 @@
                 <w:color w:val="000000"/>
                 <w:sz w:val="17"/>
               </w:rPr>
-              <w:t>1.540</w:t>
+              <w:t>1.541</w:t>
             </w:r>
           </w:p>
         </w:tc>
@@ -746,7 +746,7 @@
                 <w:color w:val="000000"/>
                 <w:sz w:val="17"/>
               </w:rPr>
-              <w:t>−10,2%</w:t>
+              <w:t>−10,1%</w:t>
             </w:r>
           </w:p>
         </w:tc>
@@ -768,7 +768,7 @@
                 <w:color w:val="000000"/>
                 <w:sz w:val="17"/>
               </w:rPr>
-              <w:t>34,2%</w:t>
+              <w:t>33,5%</w:t>
             </w:r>
           </w:p>
         </w:tc>
@@ -905,7 +905,7 @@
                 <w:color w:val="000000"/>
                 <w:sz w:val="17"/>
               </w:rPr>
-              <w:t>23,8%</w:t>
+              <w:t>24,1%</w:t>
             </w:r>
           </w:p>
         </w:tc>
@@ -996,7 +996,7 @@
                 <w:color w:val="000000"/>
                 <w:sz w:val="17"/>
               </w:rPr>
-              <w:t>1.682</w:t>
+              <w:t>1.683</w:t>
             </w:r>
           </w:p>
         </w:tc>
@@ -1018,7 +1018,7 @@
                 <w:color w:val="000000"/>
                 <w:sz w:val="17"/>
               </w:rPr>
-              <w:t>−1,9%</w:t>
+              <w:t>−1,8%</w:t>
             </w:r>
           </w:p>
         </w:tc>
@@ -1040,7 +1040,7 @@
                 <w:color w:val="000000"/>
                 <w:sz w:val="17"/>
               </w:rPr>
-              <w:t>11,5%</w:t>
+              <w:t>11,4%</w:t>
             </w:r>
           </w:p>
         </w:tc>
@@ -1177,7 +1177,7 @@
                 <w:color w:val="000000"/>
                 <w:sz w:val="17"/>
               </w:rPr>
-              <w:t>4,1%</w:t>
+              <w:t>3,5%</w:t>
             </w:r>
           </w:p>
         </w:tc>
@@ -2100,7 +2100,7 @@
           <w:color w:val="000000"/>
           <w:sz w:val="19"/>
         </w:rPr>
-        <w:t>Uma reclassificação do evento para El Niño moderado altera a projeção de 1.469 mm para 1.540 mm e a probabilidade de ano seco de 52,1% para 34,2%, o que redefine a postura da janela de transição.</w:t>
+        <w:t>Uma reclassificação do evento para El Niño moderado altera a projeção de 1.470 mm para 1.541 mm e a probabilidade de ano seco de 51,4% para 33,5%, o que redefine a postura da janela de transição.</w:t>
       </w:r>
     </w:p>
     <w:p>
@@ -2118,7 +2118,7 @@
           <w:color w:val="595959"/>
           <w:sz w:val="15"/>
         </w:rPr>
-        <w:t>Fontes: NOAA/CPC · IRI Columbia · NASA MERRA-2 · ECMWF ERA5-Land (Open-Meteo) · rede de estações Sinobras Florestal. Cenário central classificado pelo pico projetado do Niño 3.4 (2,55 °C). Documento gerado automaticamente em 21/08/2026.</w:t>
+        <w:t>Fontes: NOAA/CPC · IRI Columbia · NASA MERRA-2 · ECMWF ERA5-Land (Open-Meteo) · rede de estações Sinobras Florestal. Cenário central classificado pelo pico projetado do Niño 3.4 (2,55 °C). Documento gerado automaticamente em 24/08/2026.</w:t>
       </w:r>
     </w:p>
     <w:sectPr>

</xml_diff>

<commit_message>
auto: atualização dashboard — 24/08/2026 08:43 BRT
- Dados Open-Meteo ERA5-Land: 07/2026 incorporados
- Índices oceânicos atualizados (PSL/NOAA)
- SARIMAX x XGBoost comparados e melhor selecionado
- Cenários e BH recalculados
- Relatório executivo regerado
</commit_message>
<xml_diff>
--- a/docs/relatorio-executivo.docx
+++ b/docs/relatorio-executivo.docx
@@ -149,7 +149,7 @@
           <w:color w:val="A8322C"/>
           <w:sz w:val="19"/>
         </w:rPr>
-        <w:t>1.470 mm</w:t>
+        <w:t>1.469 mm</w:t>
       </w:r>
       <w:r>
         <w:rPr>
@@ -179,7 +179,7 @@
           <w:color w:val="000000"/>
           <w:sz w:val="19"/>
         </w:rPr>
-        <w:t xml:space="preserve"> da média histórica de 1.714 mm (1981–2025), com 51,4% de probabilidade de ano seco. O núcleo chuvoso de dezembro a março permanece operacionalmente viável, com volumes </w:t>
+        <w:t xml:space="preserve"> da média histórica de 1.714 mm (1981–2025), com 52,0% de probabilidade de ano seco. O núcleo chuvoso de dezembro a março permanece operacionalmente viável, com volumes </w:t>
       </w:r>
       <w:r>
         <w:rPr>
@@ -587,7 +587,7 @@
                 <w:color w:val="A8322C"/>
                 <w:sz w:val="17"/>
               </w:rPr>
-              <w:t>1.470</w:t>
+              <w:t>1.469</w:t>
             </w:r>
           </w:p>
         </w:tc>
@@ -633,7 +633,7 @@
                 <w:color w:val="A8322C"/>
                 <w:sz w:val="17"/>
               </w:rPr>
-              <w:t>51,4%</w:t>
+              <w:t>52,0%</w:t>
             </w:r>
           </w:p>
         </w:tc>
@@ -724,7 +724,7 @@
                 <w:color w:val="000000"/>
                 <w:sz w:val="17"/>
               </w:rPr>
-              <w:t>1.541</w:t>
+              <w:t>1.540</w:t>
             </w:r>
           </w:p>
         </w:tc>
@@ -746,7 +746,7 @@
                 <w:color w:val="000000"/>
                 <w:sz w:val="17"/>
               </w:rPr>
-              <w:t>−10,1%</w:t>
+              <w:t>−10,2%</w:t>
             </w:r>
           </w:p>
         </w:tc>
@@ -768,7 +768,7 @@
                 <w:color w:val="000000"/>
                 <w:sz w:val="17"/>
               </w:rPr>
-              <w:t>33,5%</w:t>
+              <w:t>34,0%</w:t>
             </w:r>
           </w:p>
         </w:tc>
@@ -996,7 +996,7 @@
                 <w:color w:val="000000"/>
                 <w:sz w:val="17"/>
               </w:rPr>
-              <w:t>1.683</w:t>
+              <w:t>1.682</w:t>
             </w:r>
           </w:p>
         </w:tc>
@@ -1018,7 +1018,7 @@
                 <w:color w:val="000000"/>
                 <w:sz w:val="17"/>
               </w:rPr>
-              <w:t>−1,8%</w:t>
+              <w:t>−1,9%</w:t>
             </w:r>
           </w:p>
         </w:tc>
@@ -1040,7 +1040,7 @@
                 <w:color w:val="000000"/>
                 <w:sz w:val="17"/>
               </w:rPr>
-              <w:t>11,4%</w:t>
+              <w:t>11,0%</w:t>
             </w:r>
           </w:p>
         </w:tc>
@@ -1177,7 +1177,7 @@
                 <w:color w:val="000000"/>
                 <w:sz w:val="17"/>
               </w:rPr>
-              <w:t>3,5%</w:t>
+              <w:t>3,9%</w:t>
             </w:r>
           </w:p>
         </w:tc>
@@ -2100,7 +2100,7 @@
           <w:color w:val="000000"/>
           <w:sz w:val="19"/>
         </w:rPr>
-        <w:t>Uma reclassificação do evento para El Niño moderado altera a projeção de 1.470 mm para 1.541 mm e a probabilidade de ano seco de 51,4% para 33,5%, o que redefine a postura da janela de transição.</w:t>
+        <w:t>Uma reclassificação do evento para El Niño moderado altera a projeção de 1.469 mm para 1.540 mm e a probabilidade de ano seco de 52,0% para 34,0%, o que redefine a postura da janela de transição.</w:t>
       </w:r>
     </w:p>
     <w:p>

</xml_diff>

<commit_message>
auto: atualização dashboard — 24/08/2026 08:53 BRT
- Dados Open-Meteo ERA5-Land: 07/2026 incorporados
- Índices oceânicos atualizados (PSL/NOAA)
- SARIMAX x XGBoost comparados e melhor selecionado
- Cenários e BH recalculados
- Relatório executivo regerado
</commit_message>
<xml_diff>
--- a/docs/relatorio-executivo.docx
+++ b/docs/relatorio-executivo.docx
@@ -149,7 +149,7 @@
           <w:color w:val="A8322C"/>
           <w:sz w:val="19"/>
         </w:rPr>
-        <w:t>1.469 mm</w:t>
+        <w:t>1.470 mm</w:t>
       </w:r>
       <w:r>
         <w:rPr>
@@ -179,7 +179,7 @@
           <w:color w:val="000000"/>
           <w:sz w:val="19"/>
         </w:rPr>
-        <w:t xml:space="preserve"> da média histórica de 1.714 mm (1981–2025), com 52,0% de probabilidade de ano seco. O núcleo chuvoso de dezembro a março permanece operacionalmente viável, com volumes </w:t>
+        <w:t xml:space="preserve"> da média histórica de 1.714 mm (1981–2025), com 50,7% de probabilidade de ano seco. O núcleo chuvoso de dezembro a março permanece operacionalmente viável, com volumes </w:t>
       </w:r>
       <w:r>
         <w:rPr>
@@ -587,7 +587,7 @@
                 <w:color w:val="A8322C"/>
                 <w:sz w:val="17"/>
               </w:rPr>
-              <w:t>1.469</w:t>
+              <w:t>1.470</w:t>
             </w:r>
           </w:p>
         </w:tc>
@@ -633,7 +633,7 @@
                 <w:color w:val="A8322C"/>
                 <w:sz w:val="17"/>
               </w:rPr>
-              <w:t>52,0%</w:t>
+              <w:t>50,7%</w:t>
             </w:r>
           </w:p>
         </w:tc>
@@ -724,7 +724,7 @@
                 <w:color w:val="000000"/>
                 <w:sz w:val="17"/>
               </w:rPr>
-              <w:t>1.540</w:t>
+              <w:t>1.541</w:t>
             </w:r>
           </w:p>
         </w:tc>
@@ -746,7 +746,7 @@
                 <w:color w:val="000000"/>
                 <w:sz w:val="17"/>
               </w:rPr>
-              <w:t>−10,2%</w:t>
+              <w:t>−10,1%</w:t>
             </w:r>
           </w:p>
         </w:tc>
@@ -768,7 +768,7 @@
                 <w:color w:val="000000"/>
                 <w:sz w:val="17"/>
               </w:rPr>
-              <w:t>34,0%</w:t>
+              <w:t>33,6%</w:t>
             </w:r>
           </w:p>
         </w:tc>
@@ -905,7 +905,7 @@
                 <w:color w:val="000000"/>
                 <w:sz w:val="17"/>
               </w:rPr>
-              <w:t>24,1%</w:t>
+              <w:t>24,5%</w:t>
             </w:r>
           </w:p>
         </w:tc>
@@ -996,7 +996,7 @@
                 <w:color w:val="000000"/>
                 <w:sz w:val="17"/>
               </w:rPr>
-              <w:t>1.682</w:t>
+              <w:t>1.683</w:t>
             </w:r>
           </w:p>
         </w:tc>
@@ -1018,7 +1018,7 @@
                 <w:color w:val="000000"/>
                 <w:sz w:val="17"/>
               </w:rPr>
-              <w:t>−1,9%</w:t>
+              <w:t>−1,8%</w:t>
             </w:r>
           </w:p>
         </w:tc>
@@ -1040,7 +1040,7 @@
                 <w:color w:val="000000"/>
                 <w:sz w:val="17"/>
               </w:rPr>
-              <w:t>11,0%</w:t>
+              <w:t>11,2%</w:t>
             </w:r>
           </w:p>
         </w:tc>
@@ -1177,7 +1177,7 @@
                 <w:color w:val="000000"/>
                 <w:sz w:val="17"/>
               </w:rPr>
-              <w:t>3,9%</w:t>
+              <w:t>4,5%</w:t>
             </w:r>
           </w:p>
         </w:tc>
@@ -2100,7 +2100,7 @@
           <w:color w:val="000000"/>
           <w:sz w:val="19"/>
         </w:rPr>
-        <w:t>Uma reclassificação do evento para El Niño moderado altera a projeção de 1.469 mm para 1.540 mm e a probabilidade de ano seco de 52,0% para 34,0%, o que redefine a postura da janela de transição.</w:t>
+        <w:t>Uma reclassificação do evento para El Niño moderado altera a projeção de 1.470 mm para 1.541 mm e a probabilidade de ano seco de 50,7% para 33,6%, o que redefine a postura da janela de transição.</w:t>
       </w:r>
     </w:p>
     <w:p>

</xml_diff>

<commit_message>
auto: atualização dashboard — 08/09/2026 16:33 BRT
- Dados Open-Meteo ERA5-Land: 08/2026 incorporados
- Índices oceânicos atualizados (PSL/NOAA)
- SARIMAX x XGBoost comparados e melhor selecionado
- Cenários e BH recalculados
- Relatório executivo regerado
</commit_message>
<xml_diff>
--- a/docs/relatorio-executivo.docx
+++ b/docs/relatorio-executivo.docx
@@ -48,7 +48,7 @@
           <w:color w:val="595959"/>
           <w:sz w:val="17"/>
         </w:rPr>
-        <w:t>Norte do Tocantins  ·  Horizonte ago/2026 – jul/2027  ·  Emissão 24/08/2026</w:t>
+        <w:t>Norte do Tocantins  ·  Horizonte set/2026 – ago/2027  ·  Emissão 08/09/2026</w:t>
       </w:r>
     </w:p>
     <w:p>
@@ -149,7 +149,7 @@
           <w:color w:val="A8322C"/>
           <w:sz w:val="19"/>
         </w:rPr>
-        <w:t>1.409 mm</w:t>
+        <w:t>1.524 mm</w:t>
       </w:r>
       <w:r>
         <w:rPr>
@@ -169,7 +169,7 @@
           <w:color w:val="A8322C"/>
           <w:sz w:val="19"/>
         </w:rPr>
-        <w:t>17,8% abaixo</w:t>
+        <w:t>11,1% abaixo</w:t>
       </w:r>
       <w:r>
         <w:rPr>
@@ -179,7 +179,7 @@
           <w:color w:val="000000"/>
           <w:sz w:val="19"/>
         </w:rPr>
-        <w:t xml:space="preserve"> da média histórica de 1.714 mm (1981–2025), com 66,9% de probabilidade de ano seco. O núcleo chuvoso de dezembro a março permanece operacionalmente viável, com volumes </w:t>
+        <w:t xml:space="preserve"> da média histórica de 1.714 mm (1981–2025), com 38,1% de probabilidade de ano seco. O núcleo chuvoso de dezembro a março permanece operacionalmente viável, com volumes </w:t>
       </w:r>
       <w:r>
         <w:rPr>
@@ -189,7 +189,7 @@
           <w:color w:val="000000"/>
           <w:sz w:val="19"/>
         </w:rPr>
-        <w:t>12% a 19% menores que a climatologia.</w:t>
+        <w:t>60% a 97% menores que a climatologia.</w:t>
       </w:r>
     </w:p>
     <w:p>
@@ -374,7 +374,7 @@
           <w:color w:val="595959"/>
           <w:sz w:val="17"/>
         </w:rPr>
-        <w:t>Totais acumulados para o horizonte ago/2026 – jul/2027, gerados por SARIMAX condicionado a Niño 3.4, TSA e PDO. Déficit e meses críticos referem-se ao balanço hídrico com CAD de 100 mm; meses críticos são aqueles com armazenamento de água no solo abaixo de 20 mm.</w:t>
+        <w:t>Totais acumulados para o horizonte set/2026 – ago/2027, gerados por SARIMAX condicionado a Niño 3.4, TSA e PDO. Déficit e meses críticos referem-se ao balanço hídrico com CAD de 100 mm; meses críticos são aqueles com armazenamento de água no solo abaixo de 20 mm.</w:t>
       </w:r>
     </w:p>
     <w:tbl>
@@ -587,7 +587,7 @@
                 <w:color w:val="A8322C"/>
                 <w:sz w:val="17"/>
               </w:rPr>
-              <w:t>1.409</w:t>
+              <w:t>1.524</w:t>
             </w:r>
           </w:p>
         </w:tc>
@@ -610,7 +610,7 @@
                 <w:color w:val="A8322C"/>
                 <w:sz w:val="17"/>
               </w:rPr>
-              <w:t>−17,8%</w:t>
+              <w:t>−11,1%</w:t>
             </w:r>
           </w:p>
         </w:tc>
@@ -633,7 +633,7 @@
                 <w:color w:val="A8322C"/>
                 <w:sz w:val="17"/>
               </w:rPr>
-              <w:t>66,9%</w:t>
+              <w:t>38,1%</w:t>
             </w:r>
           </w:p>
         </w:tc>
@@ -656,7 +656,7 @@
                 <w:color w:val="A8322C"/>
                 <w:sz w:val="17"/>
               </w:rPr>
-              <w:t>477</w:t>
+              <w:t>439</w:t>
             </w:r>
           </w:p>
         </w:tc>
@@ -724,7 +724,7 @@
                 <w:color w:val="000000"/>
                 <w:sz w:val="17"/>
               </w:rPr>
-              <w:t>1.491</w:t>
+              <w:t>1.602</w:t>
             </w:r>
           </w:p>
         </w:tc>
@@ -746,7 +746,7 @@
                 <w:color w:val="000000"/>
                 <w:sz w:val="17"/>
               </w:rPr>
-              <w:t>−13,0%</w:t>
+              <w:t>−6,6%</w:t>
             </w:r>
           </w:p>
         </w:tc>
@@ -768,7 +768,7 @@
                 <w:color w:val="000000"/>
                 <w:sz w:val="17"/>
               </w:rPr>
-              <w:t>45,4%</w:t>
+              <w:t>21,4%</w:t>
             </w:r>
           </w:p>
         </w:tc>
@@ -790,7 +790,7 @@
                 <w:color w:val="000000"/>
                 <w:sz w:val="17"/>
               </w:rPr>
-              <w:t>457</w:t>
+              <w:t>400</w:t>
             </w:r>
           </w:p>
         </w:tc>
@@ -859,7 +859,7 @@
                 <w:color w:val="000000"/>
                 <w:sz w:val="17"/>
               </w:rPr>
-              <w:t>1.546</w:t>
+              <w:t>1.659</w:t>
             </w:r>
           </w:p>
         </w:tc>
@@ -882,7 +882,7 @@
                 <w:color w:val="000000"/>
                 <w:sz w:val="17"/>
               </w:rPr>
-              <w:t>−9,8%</w:t>
+              <w:t>−3,2%</w:t>
             </w:r>
           </w:p>
         </w:tc>
@@ -905,7 +905,7 @@
                 <w:color w:val="000000"/>
                 <w:sz w:val="17"/>
               </w:rPr>
-              <w:t>33,0%</w:t>
+              <w:t>13,1%</w:t>
             </w:r>
           </w:p>
         </w:tc>
@@ -928,7 +928,7 @@
                 <w:color w:val="000000"/>
                 <w:sz w:val="17"/>
               </w:rPr>
-              <w:t>444</w:t>
+              <w:t>370</w:t>
             </w:r>
           </w:p>
         </w:tc>
@@ -951,7 +951,7 @@
                 <w:color w:val="000000"/>
                 <w:sz w:val="17"/>
               </w:rPr>
-              <w:t>6</w:t>
+              <w:t>4</w:t>
             </w:r>
           </w:p>
         </w:tc>
@@ -996,7 +996,7 @@
                 <w:color w:val="000000"/>
                 <w:sz w:val="17"/>
               </w:rPr>
-              <w:t>1.636</w:t>
+              <w:t>1.763</w:t>
             </w:r>
           </w:p>
         </w:tc>
@@ -1018,7 +1018,7 @@
                 <w:color w:val="000000"/>
                 <w:sz w:val="17"/>
               </w:rPr>
-              <w:t>−4,6%</w:t>
+              <w:t>+2,8%</w:t>
             </w:r>
           </w:p>
         </w:tc>
@@ -1040,7 +1040,7 @@
                 <w:color w:val="000000"/>
                 <w:sz w:val="17"/>
               </w:rPr>
-              <w:t>16,1%</w:t>
+              <w:t>5,4%</w:t>
             </w:r>
           </w:p>
         </w:tc>
@@ -1062,7 +1062,7 @@
                 <w:color w:val="000000"/>
                 <w:sz w:val="17"/>
               </w:rPr>
-              <w:t>417</w:t>
+              <w:t>314</w:t>
             </w:r>
           </w:p>
         </w:tc>
@@ -1084,7 +1084,7 @@
                 <w:color w:val="000000"/>
                 <w:sz w:val="17"/>
               </w:rPr>
-              <w:t>5</w:t>
+              <w:t>4</w:t>
             </w:r>
           </w:p>
         </w:tc>
@@ -1131,7 +1131,7 @@
                 <w:color w:val="000000"/>
                 <w:sz w:val="17"/>
               </w:rPr>
-              <w:t>1.736</w:t>
+              <w:t>1.867</w:t>
             </w:r>
           </w:p>
         </w:tc>
@@ -1154,7 +1154,7 @@
                 <w:color w:val="000000"/>
                 <w:sz w:val="17"/>
               </w:rPr>
-              <w:t>+1,3%</w:t>
+              <w:t>+8,9%</w:t>
             </w:r>
           </w:p>
         </w:tc>
@@ -1177,7 +1177,7 @@
                 <w:color w:val="000000"/>
                 <w:sz w:val="17"/>
               </w:rPr>
-              <w:t>5,1%</w:t>
+              <w:t>1,8%</w:t>
             </w:r>
           </w:p>
         </w:tc>
@@ -1200,7 +1200,7 @@
                 <w:color w:val="000000"/>
                 <w:sz w:val="17"/>
               </w:rPr>
-              <w:t>381</w:t>
+              <w:t>264</w:t>
             </w:r>
           </w:p>
         </w:tc>
@@ -1223,7 +1223,7 @@
                 <w:color w:val="000000"/>
                 <w:sz w:val="17"/>
               </w:rPr>
-              <w:t>4</w:t>
+              <w:t>3</w:t>
             </w:r>
           </w:p>
         </w:tc>
@@ -1391,7 +1391,7 @@
           <w:color w:val="595959"/>
           <w:sz w:val="17"/>
         </w:rPr>
-        <w:t>o cenário central eleva o déficit anual em 106 mm sobrea climatologia e adiciona 2 meses de solo esgotado. O excedente hídrico cai de 619 mm para 420 mm — redução de 32% na recarga do perfil.</w:t>
+        <w:t>o cenário central eleva o déficit anual em 68 mm sobrea climatologia e adiciona 2 meses de solo esgotado. O excedente hídrico cai de 619 mm para 497 mm — redução de 20% na recarga do perfil.</w:t>
       </w:r>
     </w:p>
     <w:p>
@@ -1446,7 +1446,7 @@
           <w:color w:val="000000"/>
           <w:sz w:val="19"/>
         </w:rPr>
-        <w:t xml:space="preserve"> do horizonte — sendo a maior sequência contínua de 4 meses —, contra 4 na climatologia. </w:t>
+        <w:t xml:space="preserve"> do horizonte — sendo a maior sequência contínua de 6 meses —, contra 4 na climatologia. </w:t>
       </w:r>
       <w:r>
         <w:rPr>
@@ -1456,7 +1456,7 @@
           <w:color w:val="000000"/>
           <w:sz w:val="19"/>
         </w:rPr>
-        <w:t>Na entrada da estação chuvosa, outubro projeta 101 mm contra 120 mm da climatologia</w:t>
+        <w:t>Na entrada da estação chuvosa, outubro projeta 234 mm contra 120 mm da climatologia</w:t>
       </w:r>
       <w:r>
         <w:rPr>
@@ -1466,7 +1466,7 @@
           <w:color w:val="000000"/>
           <w:sz w:val="19"/>
         </w:rPr>
-        <w:t xml:space="preserve"> e novembro, 137 mm contra 159 mm</w:t>
+        <w:t xml:space="preserve"> e novembro, 83 mm contra 159 mm</w:t>
       </w:r>
       <w:r>
         <w:rPr>
@@ -2100,7 +2100,7 @@
           <w:color w:val="000000"/>
           <w:sz w:val="19"/>
         </w:rPr>
-        <w:t>Uma reclassificação do evento para El Niño moderado altera a projeção de 1.409 mm para 1.491 mm e a probabilidade de ano seco de 66,9% para 45,4%, o que redefine a postura da janela de transição.</w:t>
+        <w:t>Uma reclassificação do evento para El Niño moderado altera a projeção de 1.524 mm para 1.602 mm e a probabilidade de ano seco de 38,1% para 21,4%, o que redefine a postura da janela de transição.</w:t>
       </w:r>
     </w:p>
     <w:p>
@@ -2118,7 +2118,7 @@
           <w:color w:val="595959"/>
           <w:sz w:val="15"/>
         </w:rPr>
-        <w:t>Fontes: NOAA/CPC · IRI Columbia · NASA MERRA-2 · ECMWF ERA5-Land (Open-Meteo) · rede de estações Sinobras Florestal. Cenário central classificado pelo pico projetado do Niño 3.4 (2,70 °C). Documento gerado automaticamente em 24/08/2026.</w:t>
+        <w:t>Fontes: NOAA/CPC · IRI Columbia · NASA MERRA-2 · ECMWF ERA5-Land (Open-Meteo) · rede de estações Sinobras Florestal. Cenário central classificado pelo pico projetado do Niño 3.4 (2,70 °C). Documento gerado automaticamente em 08/09/2026.</w:t>
       </w:r>
     </w:p>
     <w:sectPr>

</xml_diff>

<commit_message>
auto: atualização dashboard — 08/09/2026 16:35 BRT
- Dados Open-Meteo ERA5-Land: 08/2026 incorporados
- Índices oceânicos atualizados (PSL/NOAA)
- SARIMAX x XGBoost comparados e melhor selecionado
- Cenários e BH recalculados
- Relatório executivo regerado
</commit_message>
<xml_diff>
--- a/docs/relatorio-executivo.docx
+++ b/docs/relatorio-executivo.docx
@@ -179,7 +179,7 @@
           <w:color w:val="000000"/>
           <w:sz w:val="19"/>
         </w:rPr>
-        <w:t xml:space="preserve"> da média histórica de 1.714 mm (1981–2025), com 38,1% de probabilidade de ano seco. O núcleo chuvoso de dezembro a março permanece operacionalmente viável, com volumes </w:t>
+        <w:t xml:space="preserve"> da média histórica de 1.714 mm (1981–2025), com 37,2% de probabilidade de ano seco. O núcleo chuvoso de dezembro a março permanece operacionalmente viável, com volumes </w:t>
       </w:r>
       <w:r>
         <w:rPr>
@@ -633,7 +633,7 @@
                 <w:color w:val="A8322C"/>
                 <w:sz w:val="17"/>
               </w:rPr>
-              <w:t>38,1%</w:t>
+              <w:t>37,2%</w:t>
             </w:r>
           </w:p>
         </w:tc>
@@ -905,7 +905,7 @@
                 <w:color w:val="000000"/>
                 <w:sz w:val="17"/>
               </w:rPr>
-              <w:t>13,1%</w:t>
+              <w:t>13,6%</w:t>
             </w:r>
           </w:p>
         </w:tc>
@@ -1040,7 +1040,7 @@
                 <w:color w:val="000000"/>
                 <w:sz w:val="17"/>
               </w:rPr>
-              <w:t>5,4%</w:t>
+              <w:t>5,8%</w:t>
             </w:r>
           </w:p>
         </w:tc>
@@ -1177,7 +1177,7 @@
                 <w:color w:val="000000"/>
                 <w:sz w:val="17"/>
               </w:rPr>
-              <w:t>1,8%</w:t>
+              <w:t>1,9%</w:t>
             </w:r>
           </w:p>
         </w:tc>
@@ -2100,7 +2100,7 @@
           <w:color w:val="000000"/>
           <w:sz w:val="19"/>
         </w:rPr>
-        <w:t>Uma reclassificação do evento para El Niño moderado altera a projeção de 1.524 mm para 1.602 mm e a probabilidade de ano seco de 38,1% para 21,4%, o que redefine a postura da janela de transição.</w:t>
+        <w:t>Uma reclassificação do evento para El Niño moderado altera a projeção de 1.524 mm para 1.602 mm e a probabilidade de ano seco de 37,2% para 21,4%, o que redefine a postura da janela de transição.</w:t>
       </w:r>
     </w:p>
     <w:p>

</xml_diff>

<commit_message>
auto: atualização dashboard — 08/09/2026 16:37 BRT
- Dados Open-Meteo ERA5-Land: 08/2026 incorporados
- Índices oceânicos atualizados (PSL/NOAA)
- SARIMAX x XGBoost comparados e melhor selecionado
- Cenários e BH recalculados
- Relatório executivo regerado
</commit_message>
<xml_diff>
--- a/docs/relatorio-executivo.docx
+++ b/docs/relatorio-executivo.docx
@@ -179,7 +179,7 @@
           <w:color w:val="000000"/>
           <w:sz w:val="19"/>
         </w:rPr>
-        <w:t xml:space="preserve"> da média histórica de 1.714 mm (1981–2025), com 37,2% de probabilidade de ano seco. O núcleo chuvoso de dezembro a março permanece operacionalmente viável, com volumes </w:t>
+        <w:t xml:space="preserve"> da média histórica de 1.714 mm (1981–2025), com 38,9% de probabilidade de ano seco. O núcleo chuvoso de dezembro a março permanece operacionalmente viável, com volumes </w:t>
       </w:r>
       <w:r>
         <w:rPr>
@@ -633,7 +633,7 @@
                 <w:color w:val="A8322C"/>
                 <w:sz w:val="17"/>
               </w:rPr>
-              <w:t>37,2%</w:t>
+              <w:t>38,9%</w:t>
             </w:r>
           </w:p>
         </w:tc>
@@ -768,7 +768,7 @@
                 <w:color w:val="000000"/>
                 <w:sz w:val="17"/>
               </w:rPr>
-              <w:t>21,4%</w:t>
+              <w:t>21,9%</w:t>
             </w:r>
           </w:p>
         </w:tc>
@@ -905,7 +905,7 @@
                 <w:color w:val="000000"/>
                 <w:sz w:val="17"/>
               </w:rPr>
-              <w:t>13,6%</w:t>
+              <w:t>13,8%</w:t>
             </w:r>
           </w:p>
         </w:tc>
@@ -1040,7 +1040,7 @@
                 <w:color w:val="000000"/>
                 <w:sz w:val="17"/>
               </w:rPr>
-              <w:t>5,8%</w:t>
+              <w:t>5,6%</w:t>
             </w:r>
           </w:p>
         </w:tc>
@@ -1177,7 +1177,7 @@
                 <w:color w:val="000000"/>
                 <w:sz w:val="17"/>
               </w:rPr>
-              <w:t>1,9%</w:t>
+              <w:t>1,5%</w:t>
             </w:r>
           </w:p>
         </w:tc>
@@ -2100,7 +2100,7 @@
           <w:color w:val="000000"/>
           <w:sz w:val="19"/>
         </w:rPr>
-        <w:t>Uma reclassificação do evento para El Niño moderado altera a projeção de 1.524 mm para 1.602 mm e a probabilidade de ano seco de 37,2% para 21,4%, o que redefine a postura da janela de transição.</w:t>
+        <w:t>Uma reclassificação do evento para El Niño moderado altera a projeção de 1.524 mm para 1.602 mm e a probabilidade de ano seco de 38,9% para 21,9%, o que redefine a postura da janela de transição.</w:t>
       </w:r>
     </w:p>
     <w:p>

</xml_diff>

<commit_message>
auto: atualização dashboard — 08/09/2026 16:38 BRT
- Dados Open-Meteo ERA5-Land: 08/2026 incorporados
- Índices oceânicos atualizados (PSL/NOAA)
- SARIMAX x XGBoost comparados e melhor selecionado
- Cenários e BH recalculados
- Relatório executivo regerado
</commit_message>
<xml_diff>
--- a/docs/relatorio-executivo.docx
+++ b/docs/relatorio-executivo.docx
@@ -149,7 +149,7 @@
           <w:color w:val="A8322C"/>
           <w:sz w:val="19"/>
         </w:rPr>
-        <w:t>1.524 mm</w:t>
+        <w:t>1.525 mm</w:t>
       </w:r>
       <w:r>
         <w:rPr>
@@ -169,7 +169,7 @@
           <w:color w:val="A8322C"/>
           <w:sz w:val="19"/>
         </w:rPr>
-        <w:t>11,1% abaixo</w:t>
+        <w:t>11,0% abaixo</w:t>
       </w:r>
       <w:r>
         <w:rPr>
@@ -179,7 +179,7 @@
           <w:color w:val="000000"/>
           <w:sz w:val="19"/>
         </w:rPr>
-        <w:t xml:space="preserve"> da média histórica de 1.714 mm (1981–2025), com 38,9% de probabilidade de ano seco. O núcleo chuvoso de dezembro a março permanece operacionalmente viável, com volumes </w:t>
+        <w:t xml:space="preserve"> da média histórica de 1.714 mm (1981–2025), com 37,5% de probabilidade de ano seco. O núcleo chuvoso de dezembro a março permanece operacionalmente viável, com volumes </w:t>
       </w:r>
       <w:r>
         <w:rPr>
@@ -587,7 +587,7 @@
                 <w:color w:val="A8322C"/>
                 <w:sz w:val="17"/>
               </w:rPr>
-              <w:t>1.524</w:t>
+              <w:t>1.525</w:t>
             </w:r>
           </w:p>
         </w:tc>
@@ -610,7 +610,7 @@
                 <w:color w:val="A8322C"/>
                 <w:sz w:val="17"/>
               </w:rPr>
-              <w:t>−11,1%</w:t>
+              <w:t>−11,0%</w:t>
             </w:r>
           </w:p>
         </w:tc>
@@ -633,7 +633,7 @@
                 <w:color w:val="A8322C"/>
                 <w:sz w:val="17"/>
               </w:rPr>
-              <w:t>38,9%</w:t>
+              <w:t>37,5%</w:t>
             </w:r>
           </w:p>
         </w:tc>
@@ -656,7 +656,7 @@
                 <w:color w:val="A8322C"/>
                 <w:sz w:val="17"/>
               </w:rPr>
-              <w:t>439</w:t>
+              <w:t>438</w:t>
             </w:r>
           </w:p>
         </w:tc>
@@ -724,7 +724,7 @@
                 <w:color w:val="000000"/>
                 <w:sz w:val="17"/>
               </w:rPr>
-              <w:t>1.602</w:t>
+              <w:t>1.604</w:t>
             </w:r>
           </w:p>
         </w:tc>
@@ -746,7 +746,7 @@
                 <w:color w:val="000000"/>
                 <w:sz w:val="17"/>
               </w:rPr>
-              <w:t>−6,6%</w:t>
+              <w:t>−6,4%</w:t>
             </w:r>
           </w:p>
         </w:tc>
@@ -768,7 +768,7 @@
                 <w:color w:val="000000"/>
                 <w:sz w:val="17"/>
               </w:rPr>
-              <w:t>21,9%</w:t>
+              <w:t>21,4%</w:t>
             </w:r>
           </w:p>
         </w:tc>
@@ -790,7 +790,7 @@
                 <w:color w:val="000000"/>
                 <w:sz w:val="17"/>
               </w:rPr>
-              <w:t>400</w:t>
+              <w:t>399</w:t>
             </w:r>
           </w:p>
         </w:tc>
@@ -859,7 +859,7 @@
                 <w:color w:val="000000"/>
                 <w:sz w:val="17"/>
               </w:rPr>
-              <w:t>1.659</w:t>
+              <w:t>1.662</w:t>
             </w:r>
           </w:p>
         </w:tc>
@@ -882,7 +882,7 @@
                 <w:color w:val="000000"/>
                 <w:sz w:val="17"/>
               </w:rPr>
-              <w:t>−3,2%</w:t>
+              <w:t>−3,1%</w:t>
             </w:r>
           </w:p>
         </w:tc>
@@ -905,7 +905,7 @@
                 <w:color w:val="000000"/>
                 <w:sz w:val="17"/>
               </w:rPr>
-              <w:t>13,8%</w:t>
+              <w:t>13,2%</w:t>
             </w:r>
           </w:p>
         </w:tc>
@@ -928,7 +928,7 @@
                 <w:color w:val="000000"/>
                 <w:sz w:val="17"/>
               </w:rPr>
-              <w:t>370</w:t>
+              <w:t>368</w:t>
             </w:r>
           </w:p>
         </w:tc>
@@ -996,7 +996,7 @@
                 <w:color w:val="000000"/>
                 <w:sz w:val="17"/>
               </w:rPr>
-              <w:t>1.763</w:t>
+              <w:t>1.767</w:t>
             </w:r>
           </w:p>
         </w:tc>
@@ -1018,7 +1018,7 @@
                 <w:color w:val="000000"/>
                 <w:sz w:val="17"/>
               </w:rPr>
-              <w:t>+2,8%</w:t>
+              <w:t>+3,1%</w:t>
             </w:r>
           </w:p>
         </w:tc>
@@ -1040,7 +1040,7 @@
                 <w:color w:val="000000"/>
                 <w:sz w:val="17"/>
               </w:rPr>
-              <w:t>5,6%</w:t>
+              <w:t>5,5%</w:t>
             </w:r>
           </w:p>
         </w:tc>
@@ -1062,7 +1062,7 @@
                 <w:color w:val="000000"/>
                 <w:sz w:val="17"/>
               </w:rPr>
-              <w:t>314</w:t>
+              <w:t>311</w:t>
             </w:r>
           </w:p>
         </w:tc>
@@ -1131,7 +1131,7 @@
                 <w:color w:val="000000"/>
                 <w:sz w:val="17"/>
               </w:rPr>
-              <w:t>1.867</w:t>
+              <w:t>1.871</w:t>
             </w:r>
           </w:p>
         </w:tc>
@@ -1154,7 +1154,7 @@
                 <w:color w:val="000000"/>
                 <w:sz w:val="17"/>
               </w:rPr>
-              <w:t>+8,9%</w:t>
+              <w:t>+9,1%</w:t>
             </w:r>
           </w:p>
         </w:tc>
@@ -1177,7 +1177,7 @@
                 <w:color w:val="000000"/>
                 <w:sz w:val="17"/>
               </w:rPr>
-              <w:t>1,5%</w:t>
+              <w:t>1,8%</w:t>
             </w:r>
           </w:p>
         </w:tc>
@@ -1200,7 +1200,7 @@
                 <w:color w:val="000000"/>
                 <w:sz w:val="17"/>
               </w:rPr>
-              <w:t>264</w:t>
+              <w:t>262</w:t>
             </w:r>
           </w:p>
         </w:tc>
@@ -1391,7 +1391,7 @@
           <w:color w:val="595959"/>
           <w:sz w:val="17"/>
         </w:rPr>
-        <w:t>o cenário central eleva o déficit anual em 68 mm sobrea climatologia e adiciona 2 meses de solo esgotado. O excedente hídrico cai de 619 mm para 497 mm — redução de 20% na recarga do perfil.</w:t>
+        <w:t>o cenário central eleva o déficit anual em 67 mm sobrea climatologia e adiciona 2 meses de solo esgotado. O excedente hídrico cai de 619 mm para 497 mm — redução de 20% na recarga do perfil.</w:t>
       </w:r>
     </w:p>
     <w:p>
@@ -1466,7 +1466,7 @@
           <w:color w:val="000000"/>
           <w:sz w:val="19"/>
         </w:rPr>
-        <w:t xml:space="preserve"> e novembro, 83 mm contra 159 mm</w:t>
+        <w:t xml:space="preserve"> e novembro, 84 mm contra 159 mm</w:t>
       </w:r>
       <w:r>
         <w:rPr>
@@ -2100,7 +2100,7 @@
           <w:color w:val="000000"/>
           <w:sz w:val="19"/>
         </w:rPr>
-        <w:t>Uma reclassificação do evento para El Niño moderado altera a projeção de 1.524 mm para 1.602 mm e a probabilidade de ano seco de 38,9% para 21,9%, o que redefine a postura da janela de transição.</w:t>
+        <w:t>Uma reclassificação do evento para El Niño moderado altera a projeção de 1.525 mm para 1.604 mm e a probabilidade de ano seco de 37,5% para 21,4%, o que redefine a postura da janela de transição.</w:t>
       </w:r>
     </w:p>
     <w:p>

</xml_diff>

<commit_message>
auto: atualização dashboard — 11/09/2026 13:32 BRT
- Dados Open-Meteo ERA5-Land: 08/2026 incorporados
- Índices oceânicos atualizados (PSL/NOAA)
- SARIMAX x XGBoost comparados e melhor selecionado
- Cenários e BH recalculados
- Relatório executivo regerado
</commit_message>
<xml_diff>
--- a/docs/relatorio-executivo.docx
+++ b/docs/relatorio-executivo.docx
@@ -179,7 +179,7 @@
           <w:color w:val="000000"/>
           <w:sz w:val="19"/>
         </w:rPr>
-        <w:t xml:space="preserve"> da média histórica de 1.714 mm (1981–2025), com 89,4% de probabilidade de ano seco. O núcleo chuvoso de dezembro a março permanece operacionalmente viável, com volumes </w:t>
+        <w:t xml:space="preserve"> da média histórica de 1.714 mm (1981–2025), com 89,2% de probabilidade de ano seco. O núcleo chuvoso de dezembro a março permanece operacionalmente viável, com volumes </w:t>
       </w:r>
       <w:r>
         <w:rPr>
@@ -633,7 +633,7 @@
                 <w:color w:val="A8322C"/>
                 <w:sz w:val="17"/>
               </w:rPr>
-              <w:t>89,4%</w:t>
+              <w:t>89,2%</w:t>
             </w:r>
           </w:p>
         </w:tc>
@@ -768,7 +768,7 @@
                 <w:color w:val="000000"/>
                 <w:sz w:val="17"/>
               </w:rPr>
-              <w:t>77,2%</w:t>
+              <w:t>76,4%</w:t>
             </w:r>
           </w:p>
         </w:tc>
@@ -905,7 +905,7 @@
                 <w:color w:val="000000"/>
                 <w:sz w:val="17"/>
               </w:rPr>
-              <w:t>64,4%</w:t>
+              <w:t>64,9%</w:t>
             </w:r>
           </w:p>
         </w:tc>
@@ -1177,7 +1177,7 @@
                 <w:color w:val="000000"/>
                 <w:sz w:val="17"/>
               </w:rPr>
-              <w:t>25,5%</w:t>
+              <w:t>25,6%</w:t>
             </w:r>
           </w:p>
         </w:tc>
@@ -2100,7 +2100,7 @@
           <w:color w:val="000000"/>
           <w:sz w:val="19"/>
         </w:rPr>
-        <w:t>Uma reclassificação do evento para El Niño moderado altera a projeção de 1.287 mm para 1.360 mm e a probabilidade de ano seco de 89,4% para 77,2%, o que redefine a postura da janela de transição.</w:t>
+        <w:t>Uma reclassificação do evento para El Niño moderado altera a projeção de 1.287 mm para 1.360 mm e a probabilidade de ano seco de 89,2% para 76,4%, o que redefine a postura da janela de transição.</w:t>
       </w:r>
     </w:p>
     <w:p>

</xml_diff>

<commit_message>
auto: atualização dashboard — 11/09/2026 14:02 BRT
- Dados Open-Meteo ERA5-Land: 08/2026 incorporados
- Índices oceânicos atualizados (PSL/NOAA)
- SARIMAX x XGBoost comparados e melhor selecionado
- Cenários e BH recalculados
- Relatório executivo regerado
</commit_message>
<xml_diff>
--- a/docs/relatorio-executivo.docx
+++ b/docs/relatorio-executivo.docx
@@ -179,7 +179,7 @@
           <w:color w:val="000000"/>
           <w:sz w:val="19"/>
         </w:rPr>
-        <w:t xml:space="preserve"> da média histórica de 1.714 mm (1981–2025), com 89,2% de probabilidade de ano seco. O núcleo chuvoso de dezembro a março permanece operacionalmente viável, com volumes </w:t>
+        <w:t xml:space="preserve"> da média histórica de 1.714 mm (1981–2025), com 89,4% de probabilidade de ano seco. O núcleo chuvoso de dezembro a março permanece operacionalmente viável, com volumes </w:t>
       </w:r>
       <w:r>
         <w:rPr>
@@ -633,7 +633,7 @@
                 <w:color w:val="A8322C"/>
                 <w:sz w:val="17"/>
               </w:rPr>
-              <w:t>89,2%</w:t>
+              <w:t>89,4%</w:t>
             </w:r>
           </w:p>
         </w:tc>
@@ -768,7 +768,7 @@
                 <w:color w:val="000000"/>
                 <w:sz w:val="17"/>
               </w:rPr>
-              <w:t>76,4%</w:t>
+              <w:t>77,1%</w:t>
             </w:r>
           </w:p>
         </w:tc>
@@ -905,7 +905,7 @@
                 <w:color w:val="000000"/>
                 <w:sz w:val="17"/>
               </w:rPr>
-              <w:t>64,9%</w:t>
+              <w:t>63,6%</w:t>
             </w:r>
           </w:p>
         </w:tc>
@@ -1040,7 +1040,7 @@
                 <w:color w:val="000000"/>
                 <w:sz w:val="17"/>
               </w:rPr>
-              <w:t>45,2%</w:t>
+              <w:t>45,9%</w:t>
             </w:r>
           </w:p>
         </w:tc>
@@ -1177,7 +1177,7 @@
                 <w:color w:val="000000"/>
                 <w:sz w:val="17"/>
               </w:rPr>
-              <w:t>25,6%</w:t>
+              <w:t>26,1%</w:t>
             </w:r>
           </w:p>
         </w:tc>
@@ -2100,7 +2100,7 @@
           <w:color w:val="000000"/>
           <w:sz w:val="19"/>
         </w:rPr>
-        <w:t>Uma reclassificação do evento para El Niño moderado altera a projeção de 1.287 mm para 1.360 mm e a probabilidade de ano seco de 89,2% para 76,4%, o que redefine a postura da janela de transição.</w:t>
+        <w:t>Uma reclassificação do evento para El Niño moderado altera a projeção de 1.287 mm para 1.360 mm e a probabilidade de ano seco de 89,4% para 77,1%, o que redefine a postura da janela de transição.</w:t>
       </w:r>
     </w:p>
     <w:p>

</xml_diff>

<commit_message>
fix: corrige Target de 2 hyperlinks (INMET/ANA) para o artigo exato
As URLs de INMET e ANA em FONTES_EXTERNAS respondiam HTTP 200 mas
apontavam para página institucional genérica (portal.inmet.gov.br/
noticias/el-niño-em-2026 e gov.br/ana/.../sala-de-situacao/...), não
para o artigo/notícia específicos que sustentam a citação no texto —
link "não quebrado" não é o mesmo que link certo.

Usuário fez fetch direto (não busca indexada) de cada URL abaixo e
confirmou HTTP 200 com o conteúdo que sustenta a citação:
- INMET: .../de-la-ni%C3%B1a-a-um-poss%C3%ADvel-el-ni%C3%B1o-muito-forte-...
- ANA:   .../ana-aponta-reducao-no-armazenamento-dos-reservatorios-do-sin-...

Confirmado extraindo os 4 Targets reais de
word/_rels/document.xml.rels (não só inspeção visual) — os 4 batem
exatamente com as URLs esperadas. Ainda cabe em 2 páginas.

Co-Authored-By: Claude Sonnet 5 <noreply@anthropic.com>
Claude-Session: https://claude.ai/code/session_01PsS5tQLtw3pCw2s3jQuTeY
</commit_message>
<xml_diff>
--- a/docs/relatorio-executivo.docx
+++ b/docs/relatorio-executivo.docx
@@ -2225,7 +2225,7 @@
             <w:color w:val="1155CC"/>
             <w:u w:val="single"/>
           </w:rPr>
-          <w:t xml:space="preserve">https://portal.inmet.gov.br/noticias/el-ni%C3%B1o-em-2026</w:t>
+          <w:t xml:space="preserve">https://portal.inmet.gov.br/noticias/de-la-ni%C3%B1a-a-um-poss%C3%ADvel-el-ni%C3%B1o-muito-forte-veja-a-evolu%C3%A7%C3%A3o-das-proje%C3%A7%C3%B5es-em-2026</w:t>
         </w:r>
       </w:hyperlink>
       <w:r>
@@ -2293,7 +2293,7 @@
             <w:color w:val="1155CC"/>
             <w:u w:val="single"/>
           </w:rPr>
-          <w:t xml:space="preserve">https://www.gov.br/ana/pt-br/sala-de-situacao/reservatorios-do-sistema-interligado-nacional-sin</w:t>
+          <w:t xml:space="preserve">https://www.gov.br/ana/pt-br/assuntos/noticias-e-eventos/noticias-periodo-eleitoral-2026/ana-aponta-reducao-no-armazenamento-dos-reservatorios-do-sin-e-detalha-panorama-de-rios-e-da-seca-na-3a-edicao-do-painel-el-nino</w:t>
         </w:r>
       </w:hyperlink>
     </w:p>

</xml_diff>